<commit_message>
Started working on the Introduction
</commit_message>
<xml_diff>
--- a/docs/manuscripts/qualification.docx
+++ b/docs/manuscripts/qualification.docx
@@ -1076,47 +1076,7 @@
       </w:r>
       <w:r>
         <w:rPr/>
-        <w:t xml:space="preserve">: </w:t>
-      </w:r>
-      <w:r>
-        <w:rPr/>
-        <w:t>hybridisation</w:t>
-      </w:r>
-      <w:r>
-        <w:rPr/>
-        <w:t xml:space="preserve">, </w:t>
-      </w:r>
-      <w:r>
-        <w:rPr/>
-        <w:t>genomics</w:t>
-      </w:r>
-      <w:r>
-        <w:rPr/>
-        <w:t xml:space="preserve">, </w:t>
-      </w:r>
-      <w:r>
-        <w:rPr/>
-        <w:t>pipeline</w:t>
-      </w:r>
-      <w:r>
-        <w:rPr/>
-        <w:t xml:space="preserve">, </w:t>
-      </w:r>
-      <w:r>
-        <w:rPr/>
-        <w:t>evolution</w:t>
-      </w:r>
-      <w:r>
-        <w:rPr/>
-        <w:t xml:space="preserve">, </w:t>
-      </w:r>
-      <w:r>
-        <w:rPr/>
-        <w:t>sea turtles</w:t>
-      </w:r>
-      <w:r>
-        <w:rPr/>
-        <w:t>.</w:t>
+        <w:t>: hybridisation, genomics, pipeline, evolution, sea turtles.</w:t>
       </w:r>
       <w:r>
         <w:br w:type="page"/>
@@ -1142,15 +1102,7 @@
       </w:pPr>
       <w:r>
         <w:rPr/>
-        <w:t xml:space="preserve">O intercruzamento de populações ou espécies aparentadas pode resultar na formação de uma prole híbrida. Com o acúmulo de dados e o estudo mais aprofundado de populações naturais, foi possível averiguar que a hibridação ocorre na natureza com uma frequência maior do que antes se acreditava, trazendo à tona discussões sobre o papel evolutivo deste fenômeno. Entretanto, há poucos estudos focados nas dinâmicas evolutivas ao nível genômico de populações híbridas, especialmente em relação a conservação e biodiversidade, cenário que tem se alterado graças à maior disponibilidade de genomas de referência de alta qualidade de espécies não-modelo. Nosso objetivo, neste trabalho, é compreender a influência de fenômenos evolutivos - como seleção, deriva e desequilíbrio de ligação - e suas consequências em genomas de híbridos. Em primeiro momento, obtivemos acesso a dados de ressequenciamento de quatro espécies de tartarugas marinhas, aliados a novos genomas de referência de alta qualidade. Estes organismos representam um modelo adequado para o estudo proposto, visto que a hibridação é um fenômeno já descrito </w:t>
-      </w:r>
-      <w:r>
-        <w:rPr/>
-        <w:t>n</w:t>
-      </w:r>
-      <w:r>
-        <w:rPr/>
-        <w:t xml:space="preserve">estas espécies. Ademais, todas as espécies viventes de tartarugas marinhas são consideradas ameaçadas de extinção, tornando-as de grande importância para a conservação. Antes de analisar a dinâmica evolutiva de genomas de híbridos destas espécies, é essencial entender a estrutura populacional e o nível de hibridação. Com isso, utilizamos uma abordagem por referência para analisar os dados de variantes genômicas de amostras previamente publicadas – mas não extensamente exploradas. Através destas análises, observamos que o maior eixo de hibridação ocorre entre as espécies </w:t>
+        <w:t xml:space="preserve">O intercruzamento de populações ou espécies aparentadas pode resultar na formação de uma prole híbrida. Com o acúmulo de dados e o estudo mais aprofundado de populações naturais, foi possível averiguar que a hibridação ocorre na natureza com uma frequência maior do que antes se acreditava, trazendo à tona discussões sobre o papel evolutivo deste fenômeno. Entretanto, há poucos estudos focados nas dinâmicas evolutivas ao nível genômico de populações híbridas, especialmente em relação a conservação e biodiversidade, cenário que tem se alterado graças à maior disponibilidade de genomas de referência de alta qualidade de espécies não-modelo. Nosso objetivo, neste trabalho, é compreender a influência de fenômenos evolutivos - como seleção, deriva e desequilíbrio de ligação - e suas consequências em genomas de híbridos. Em primeiro momento, obtivemos acesso a dados de ressequenciamento de quatro espécies de tartarugas marinhas, aliados a novos genomas de referência de alta qualidade. Estes organismos representam um modelo adequado para o estudo proposto, visto que a hibridação é um fenômeno já descrito nestas espécies. Ademais, todas as espécies viventes de tartarugas marinhas são consideradas ameaçadas de extinção, tornando-as de grande importância para a conservação. Antes de analisar a dinâmica evolutiva de genomas de híbridos destas espécies, é essencial entender a estrutura populacional e o nível de hibridação. Com isso, utilizamos uma abordagem por referência para analisar os dados de variantes genômicas de amostras previamente publicadas – mas não extensamente exploradas. Através destas análises, observamos que o maior eixo de hibridação ocorre entre as espécies </w:t>
       </w:r>
       <w:r>
         <w:rPr>
@@ -1172,15 +1124,7 @@
       </w:r>
       <w:r>
         <w:rPr/>
-        <w:t xml:space="preserve">, com a presença de híbridos de primeira geração. Também identificamos, com alta confiabilidade, evidências de híbridos de segunda geração, retrocruzamentos e </w:t>
-      </w:r>
-      <w:r>
-        <w:rPr/>
-        <w:t xml:space="preserve">potenciais eventos de </w:t>
-      </w:r>
-      <w:r>
-        <w:rPr/>
-        <w:t xml:space="preserve">introgressão. Em menor frequência, foram observados híbridos envolvendo </w:t>
+        <w:t xml:space="preserve">, com a presença de híbridos de primeira geração. Também identificamos, com alta confiabilidade, evidências de híbridos de segunda geração, retrocruzamentos e potenciais eventos de introgressão. Em menor frequência, foram observados híbridos envolvendo </w:t>
       </w:r>
       <w:r>
         <w:rPr>
@@ -1256,6 +1200,7 @@
         <w:p>
           <w:pPr>
             <w:pStyle w:val="TOCHeading"/>
+            <w:spacing w:before="0" w:after="850"/>
             <w:rPr/>
           </w:pPr>
           <w:r>
@@ -1296,6 +1241,11 @@
                 <w:rStyle w:val="IndexLink"/>
               </w:rPr>
               <w:t>4 Materials and methods</w:t>
+            </w:r>
+            <w:r>
+              <w:rPr>
+                <w:rStyle w:val="IndexLink"/>
+              </w:rPr>
               <w:tab/>
               <w:t>6</w:t>
             </w:r>
@@ -1502,6 +1452,483 @@
       </w:pPr>
       <w:r>
         <w:rPr/>
+        <w:t>1 Introduction</w:t>
+      </w:r>
+    </w:p>
+    <w:p>
+      <w:pPr>
+        <w:pStyle w:val="BodyText"/>
+        <w:bidi w:val="0"/>
+        <w:rPr/>
+      </w:pPr>
+      <w:r>
+        <w:rPr/>
+        <w:t>When an ancestral population experiences some sort of division within itself – be it physical, behavioural or purely genetic – the new descending populations may develop in a plethora of manners. One such possibility is that the two newly split populations continue to diverge in isolation, a process through which, under the influence of natural selection and genetic drift, will eventually favour the emergence and deepening of reproductive barriers. As time passes, these two populations will accumulate enough differences to now be considered two distinct species – a process known as speciation (</w:t>
+      </w:r>
+      <w:commentRangeStart w:id="0"/>
+      <w:r>
+        <w:rPr/>
+        <w:t>Ref</w:t>
+      </w:r>
+      <w:r>
+        <w:rPr/>
+      </w:r>
+      <w:commentRangeEnd w:id="0"/>
+      <w:r>
+        <w:commentReference w:id="0"/>
+      </w:r>
+      <w:r>
+        <w:rPr/>
+        <w:t>).</w:t>
+      </w:r>
+    </w:p>
+    <w:p>
+      <w:pPr>
+        <w:pStyle w:val="BodyTextFirstIndent"/>
+        <w:bidi w:val="0"/>
+        <w:rPr/>
+      </w:pPr>
+      <w:r>
+        <w:rPr/>
+        <w:t>However, a not-uncommon scenario arises when the two separated populations come into contact once again, either after developing strong barriers to interbreeding or not (</w:t>
+      </w:r>
+      <w:commentRangeStart w:id="1"/>
+      <w:r>
+        <w:rPr/>
+        <w:t>Ref</w:t>
+      </w:r>
+      <w:r>
+        <w:rPr/>
+      </w:r>
+      <w:commentRangeEnd w:id="1"/>
+      <w:r>
+        <w:commentReference w:id="1"/>
+      </w:r>
+      <w:r>
+        <w:rPr/>
+        <w:t xml:space="preserve">). What unfolds next, once more, also varies: the incipient speciation process may be interrupted by a significant amount of gene flow, the populations may not be able to cross anymore and thus may now be safely considered two separate species under the biological species concept </w:t>
+      </w:r>
+      <w:r>
+        <w:rPr>
+          <w:shd w:fill="FFFF00" w:val="clear"/>
+        </w:rPr>
+        <w:t>(Ref)</w:t>
+      </w:r>
+      <w:r>
+        <w:rPr/>
+        <w:t>; or, on the other hand, there may be enough similarity between the two populations that, in a small proportion, can result in mixed offspring. The latter, where two distinct populations – or species, for that matter – come into secondary contact and interbreed forming a hybrid offspring, is a phenomenon know as hybridisation (</w:t>
+      </w:r>
+      <w:commentRangeStart w:id="2"/>
+      <w:r>
+        <w:rPr/>
+        <w:t>Ref</w:t>
+      </w:r>
+      <w:r>
+        <w:rPr/>
+      </w:r>
+      <w:commentRangeEnd w:id="2"/>
+      <w:r>
+        <w:commentReference w:id="2"/>
+      </w:r>
+      <w:r>
+        <w:rPr/>
+        <w:t>).</w:t>
+      </w:r>
+    </w:p>
+    <w:p>
+      <w:pPr>
+        <w:pStyle w:val="BodyTextFirstIndent"/>
+        <w:bidi w:val="0"/>
+        <w:rPr/>
+      </w:pPr>
+      <w:r>
+        <w:rPr/>
+        <w:t xml:space="preserve">For long, hybridisation has been known, especially since the crossing of different populations and species was critical for major developments in human history, such as the selection of modern wheat </w:t>
+      </w:r>
+      <w:r>
+        <w:rPr>
+          <w:shd w:fill="FFFF00" w:val="clear"/>
+        </w:rPr>
+        <w:t>(Ref)</w:t>
+      </w:r>
+      <w:r>
+        <w:rPr/>
+        <w:t xml:space="preserve">, corn </w:t>
+      </w:r>
+      <w:r>
+        <w:rPr>
+          <w:shd w:fill="FFFF00" w:val="clear"/>
+        </w:rPr>
+        <w:t>(Ref)</w:t>
+      </w:r>
+      <w:r>
+        <w:rPr/>
+        <w:t xml:space="preserve"> and breeds of dogs </w:t>
+      </w:r>
+      <w:r>
+        <w:rPr>
+          <w:shd w:fill="FFFF00" w:val="clear"/>
+        </w:rPr>
+        <w:t>(Ref)</w:t>
+      </w:r>
+      <w:r>
+        <w:rPr/>
+        <w:t xml:space="preserve">, pigeons </w:t>
+      </w:r>
+      <w:r>
+        <w:rPr>
+          <w:shd w:fill="FFFF00" w:val="clear"/>
+        </w:rPr>
+        <w:t>(Ref)</w:t>
+      </w:r>
+      <w:r>
+        <w:rPr/>
+        <w:t xml:space="preserve"> and many other animals used for competition, breeding or to be merely kept as pets.</w:t>
+      </w:r>
+    </w:p>
+    <w:p>
+      <w:pPr>
+        <w:pStyle w:val="BodyTextFirstIndent"/>
+        <w:bidi w:val="0"/>
+        <w:rPr/>
+      </w:pPr>
+      <w:r>
+        <w:rPr/>
+        <w:t xml:space="preserve">Maybe as an effect of this extensive human intervention in the process of hybridisation, the existence of hybrids in nature was mostly seen as an extremely rare, and mostly unsuccessful event </w:t>
+      </w:r>
+      <w:r>
+        <w:rPr>
+          <w:shd w:fill="FFFF00" w:val="clear"/>
+        </w:rPr>
+        <w:t>(Ref)</w:t>
+      </w:r>
+      <w:r>
+        <w:rPr/>
+        <w:t xml:space="preserve">. In most cases, hybrid offspring was considered to be either sterile </w:t>
+      </w:r>
+      <w:r>
+        <w:rPr>
+          <w:shd w:fill="FFFF00" w:val="clear"/>
+        </w:rPr>
+        <w:t>(Ref)</w:t>
+      </w:r>
+      <w:r>
+        <w:rPr/>
+        <w:t xml:space="preserve"> – with some going as far as to call them “evolutionary dead-ends” </w:t>
+      </w:r>
+      <w:r>
+        <w:rPr>
+          <w:shd w:fill="FFFF00" w:val="clear"/>
+        </w:rPr>
+        <w:t>(Ref)</w:t>
+      </w:r>
+      <w:r>
+        <w:rPr/>
+        <w:t xml:space="preserve"> – or the carriers of deleterious combinations of alleles that would render them unsuited for survival </w:t>
+      </w:r>
+      <w:r>
+        <w:rPr>
+          <w:shd w:fill="FFFF00" w:val="clear"/>
+        </w:rPr>
+        <w:t>(Ref)</w:t>
+      </w:r>
+      <w:r>
+        <w:rPr/>
+        <w:t>.</w:t>
+      </w:r>
+    </w:p>
+    <w:p>
+      <w:pPr>
+        <w:pStyle w:val="BodyTextFirstIndent"/>
+        <w:bidi w:val="0"/>
+        <w:rPr/>
+      </w:pPr>
+      <w:r>
+        <w:rPr/>
+        <w:t xml:space="preserve">This somewhat “pessimistic” vision of hybrids is not completely at fault, though. Many known and described genetic incompatibilities may arise in a hybrid offspring which can, by the most part, explain their general non-viability: from an unfit number of chromosomes that can disrupt proper meiotic pairing </w:t>
+      </w:r>
+      <w:r>
+        <w:rPr>
+          <w:shd w:fill="FFFF00" w:val="clear"/>
+        </w:rPr>
+        <w:t>(Ref)</w:t>
+      </w:r>
+      <w:r>
+        <w:rPr/>
+        <w:t xml:space="preserve"> and the breaking of co-adapted gene networks </w:t>
+      </w:r>
+      <w:r>
+        <w:rPr>
+          <w:shd w:fill="FFFF00" w:val="clear"/>
+        </w:rPr>
+        <w:t>(Ref)</w:t>
+      </w:r>
+      <w:r>
+        <w:rPr/>
+        <w:t xml:space="preserve">, to Dobzhansky-Muller genetic incompatibilities </w:t>
+      </w:r>
+      <w:r>
+        <w:rPr>
+          <w:shd w:fill="FFFF00" w:val="clear"/>
+        </w:rPr>
+        <w:t>(Ref)</w:t>
+      </w:r>
+      <w:r>
+        <w:rPr/>
+        <w:t>. In fact, hybridisation in nature seems to closely match the expectations regarding the evolution of new mutations, under which most events are assumed to be deleterious and thus are expected to be quickly eliminated by purifying selection (</w:t>
+      </w:r>
+      <w:commentRangeStart w:id="3"/>
+      <w:r>
+        <w:rPr/>
+        <w:t>Ref</w:t>
+      </w:r>
+      <w:r>
+        <w:rPr/>
+      </w:r>
+      <w:commentRangeEnd w:id="3"/>
+      <w:r>
+        <w:commentReference w:id="3"/>
+      </w:r>
+      <w:r>
+        <w:rPr/>
+        <w:t>).</w:t>
+      </w:r>
+    </w:p>
+    <w:p>
+      <w:pPr>
+        <w:pStyle w:val="BodyTextFirstIndent"/>
+        <w:bidi w:val="0"/>
+        <w:rPr/>
+      </w:pPr>
+      <w:r>
+        <w:rPr/>
+        <w:t xml:space="preserve">Nonetheless, accumulating evidence has shown that hybridisation is much more common in nature than once believed, being now estimated to occur in as much as 10% of vertebrate species </w:t>
+      </w:r>
+      <w:r>
+        <w:rPr>
+          <w:shd w:fill="FFFF00" w:val="clear"/>
+        </w:rPr>
+        <w:t>(Ref)</w:t>
+      </w:r>
+      <w:r>
+        <w:rPr/>
+        <w:t>. However, whether hybrid zones were always this frequent or are the direct result of anthropogenic changes to the environment is a question yet to be fully elucidated.</w:t>
+      </w:r>
+    </w:p>
+    <w:p>
+      <w:pPr>
+        <w:pStyle w:val="BodyTextFirstIndent"/>
+        <w:bidi w:val="0"/>
+        <w:rPr/>
+      </w:pPr>
+      <w:r>
+        <w:rPr/>
+        <w:t xml:space="preserve">Moreover, comprehending the evolutionary impacts of hybridisation, especially when it comes to the genomic features of hybrids and its interplay with the environment, is an endeavour still in its infancy </w:t>
+      </w:r>
+      <w:r>
+        <w:rPr>
+          <w:shd w:fill="FFFF00" w:val="clear"/>
+        </w:rPr>
+        <w:t>(Ref)</w:t>
+      </w:r>
+      <w:r>
+        <w:rPr/>
+        <w:t xml:space="preserve">. On one side, genomic incompatibilities and sterility are well-known and extensively described </w:t>
+      </w:r>
+      <w:r>
+        <w:rPr>
+          <w:shd w:fill="FFFF00" w:val="clear"/>
+        </w:rPr>
+        <w:t>(Ref)</w:t>
+      </w:r>
+      <w:r>
+        <w:rPr/>
+        <w:t xml:space="preserve">. But on the other hand, there’s still a lack in both the mechanistic explanations of such incompatibilities at the genomic level, and a presumed understudy of other, potentially non-deleterious effects of hybridisation </w:t>
+      </w:r>
+      <w:r>
+        <w:rPr>
+          <w:shd w:fill="FFFF00" w:val="clear"/>
+        </w:rPr>
+        <w:t>(Ref)</w:t>
+      </w:r>
+      <w:r>
+        <w:rPr/>
+        <w:t>.</w:t>
+      </w:r>
+    </w:p>
+    <w:p>
+      <w:pPr>
+        <w:pStyle w:val="BodyTextFirstIndent"/>
+        <w:bidi w:val="0"/>
+        <w:rPr/>
+      </w:pPr>
+      <w:r>
+        <w:rPr/>
+        <w:t xml:space="preserve">In fact, in many systems where hybrids are known to occur in nature, they can be a source of genetic variability which, in turn, may favour the long-term adaptability of a species </w:t>
+      </w:r>
+      <w:r>
+        <w:rPr>
+          <w:shd w:fill="FFFF00" w:val="clear"/>
+        </w:rPr>
+        <w:t>(Ref)</w:t>
+      </w:r>
+      <w:r>
+        <w:rPr/>
+        <w:t xml:space="preserve">, whereas in others, hybrids may act as a genomic barrier to gene flow, favouring reproductive isolation and speciation </w:t>
+      </w:r>
+      <w:r>
+        <w:rPr>
+          <w:shd w:fill="FFFF00" w:val="clear"/>
+        </w:rPr>
+        <w:t>(Ref)</w:t>
+      </w:r>
+      <w:r>
+        <w:rPr/>
+        <w:t>.</w:t>
+      </w:r>
+    </w:p>
+    <w:p>
+      <w:pPr>
+        <w:pStyle w:val="BodyTextFirstIndent"/>
+        <w:bidi w:val="0"/>
+        <w:rPr/>
+      </w:pPr>
+      <w:r>
+        <w:rPr/>
+        <w:t xml:space="preserve">When hybridisation occurs successfully across many generations, producing fertile hybrid offspring that are able to back-cross with at least one of the parents, they may act as a sort of genomic “bridge” between both parental species, bringing genomic variants from one into the genome of the other – a phenomenon known as introgression </w:t>
+      </w:r>
+      <w:r>
+        <w:rPr>
+          <w:shd w:fill="FFFF00" w:val="clear"/>
+        </w:rPr>
+        <w:t>(Ref)</w:t>
+      </w:r>
+      <w:r>
+        <w:rPr/>
+        <w:t xml:space="preserve">. When this happens, it may occasionally introduce adaptive variants in the gene pool of the receiving species, while it might as well carry maladaptive loci. Both types of introgression were identified, for example, in the human genome, having been presumably carried over by repeated events of hybridisation with Neanderthals, followed by multiple instances of back-crossing </w:t>
+      </w:r>
+      <w:r>
+        <w:rPr>
+          <w:shd w:fill="FFFF00" w:val="clear"/>
+        </w:rPr>
+        <w:t>(Ref)</w:t>
+      </w:r>
+      <w:r>
+        <w:rPr/>
+        <w:t xml:space="preserve">. Additionally, the introduction of desirable variants through artificially selected instances of admixture can also be associated, for example, </w:t>
+      </w:r>
+      <w:commentRangeStart w:id="4"/>
+      <w:r>
+        <w:rPr/>
+        <w:t>with a higher yield in cattle (Ref)</w:t>
+      </w:r>
+      <w:r>
+        <w:rPr/>
+      </w:r>
+      <w:commentRangeEnd w:id="4"/>
+      <w:r>
+        <w:commentReference w:id="4"/>
+      </w:r>
+      <w:r>
+        <w:rPr/>
+        <w:t>.</w:t>
+      </w:r>
+    </w:p>
+    <w:p>
+      <w:pPr>
+        <w:pStyle w:val="BodyTextFirstIndent"/>
+        <w:bidi w:val="0"/>
+        <w:rPr/>
+      </w:pPr>
+      <w:r>
+        <w:rPr/>
+        <w:t xml:space="preserve">That being said, the extent and impact of hybridisation still scarcely studied when it comes to endangered, key biodiversity taxa </w:t>
+      </w:r>
+      <w:r>
+        <w:rPr>
+          <w:shd w:fill="FFFF00" w:val="clear"/>
+        </w:rPr>
+        <w:t>(Ref)</w:t>
+      </w:r>
+      <w:r>
+        <w:rPr/>
+        <w:t xml:space="preserve">. Historically, the reason for this could lay on the fact that many studies, especially those regarding the impact of evolutionary forces on the genomes of hybrids, depend or are hugely facilitated by the availability of high-quality reference genomes, a resource that is seldom available for non-model species </w:t>
+      </w:r>
+      <w:r>
+        <w:rPr>
+          <w:shd w:fill="FFFF00" w:val="clear"/>
+        </w:rPr>
+        <w:t>(Ref)</w:t>
+      </w:r>
+      <w:r>
+        <w:rPr/>
+        <w:t xml:space="preserve">. However, this scenario has recently been rapidly changed, much due to the improvement of sequencing technologies </w:t>
+      </w:r>
+      <w:r>
+        <w:rPr>
+          <w:shd w:fill="FFFF00" w:val="clear"/>
+        </w:rPr>
+        <w:t>(Ref)</w:t>
+      </w:r>
+      <w:r>
+        <w:rPr/>
+        <w:t xml:space="preserve">, the successful attempts at sequencing genomes of museum specimens </w:t>
+      </w:r>
+      <w:r>
+        <w:rPr>
+          <w:shd w:fill="FFFF00" w:val="clear"/>
+        </w:rPr>
+        <w:t xml:space="preserve">(Ref) </w:t>
+      </w:r>
+      <w:r>
+        <w:rPr/>
+        <w:t xml:space="preserve">and the decreasing cost of sequencing </w:t>
+      </w:r>
+      <w:r>
+        <w:rPr>
+          <w:shd w:fill="FFFF00" w:val="clear"/>
+        </w:rPr>
+        <w:t>(Ref)</w:t>
+      </w:r>
+      <w:r>
+        <w:rPr/>
+        <w:t xml:space="preserve">. In addition to that, the effort of large, national and international consortia focused on producing a massive number of high-quality reference genomes of a diversity of groups of organisms has largely accelerated the development of new technologies, techniques and significantly increased the availability of genomic data for non-model species </w:t>
+      </w:r>
+      <w:r>
+        <w:rPr>
+          <w:shd w:fill="FFFF00" w:val="clear"/>
+        </w:rPr>
+        <w:t>(Ref)</w:t>
+      </w:r>
+      <w:r>
+        <w:rPr/>
+        <w:t>.</w:t>
+      </w:r>
+    </w:p>
+    <w:p>
+      <w:pPr>
+        <w:pStyle w:val="BodyTextFirstIndent"/>
+        <w:bidi w:val="0"/>
+        <w:rPr/>
+      </w:pPr>
+      <w:r>
+        <w:rPr/>
+      </w:r>
+    </w:p>
+    <w:p>
+      <w:pPr>
+        <w:pStyle w:val="Heading1"/>
+        <w:numPr>
+          <w:ilvl w:val="0"/>
+          <w:numId w:val="1"/>
+        </w:numPr>
+        <w:bidi w:val="0"/>
+        <w:spacing w:before="0" w:after="850"/>
+        <w:ind w:hanging="0" w:start="0"/>
+        <w:rPr/>
+      </w:pPr>
+      <w:r>
+        <w:rPr/>
         <w:t>2 Justification</w:t>
       </w:r>
     </w:p>
@@ -1794,7 +2221,7 @@
         <w:rPr/>
         <w:t xml:space="preserve">. Direct access to the quality-trimmed FASTQ files for all samples, as well as the assembled reference genomes (unpublished) was provided by Dr. Larissa Arantes and Dr. Camila Mazzoni from the Berlin Centre for Genomics in Biodiversity Research (BeGenDiv), through personal communication. Samples were gathered between 2003 and 2018, with both targeted and opportunistic sampling efforts, along the eastern coast of Brazil, a part of the Southern Caribbean and in scattered locations on the southeastern Atlantic </w:t>
       </w:r>
-      <w:commentRangeStart w:id="0"/>
+      <w:commentRangeStart w:id="5"/>
       <w:r>
         <w:rPr>
           <w:shd w:fill="auto" w:val="clear"/>
@@ -1806,9 +2233,9 @@
           <w:shd w:fill="auto" w:val="clear"/>
         </w:rPr>
       </w:r>
-      <w:commentRangeEnd w:id="0"/>
-      <w:r>
-        <w:commentReference w:id="0"/>
+      <w:commentRangeEnd w:id="5"/>
+      <w:r>
+        <w:commentReference w:id="5"/>
       </w:r>
       <w:r>
         <w:rPr/>
@@ -3048,7 +3475,7 @@
         <w:rPr/>
         <w:t xml:space="preserve">We successfully mapped all 274 samples against the four evaluated reference genomes. On average, </w:t>
       </w:r>
-      <w:commentRangeStart w:id="1"/>
+      <w:commentRangeStart w:id="6"/>
       <w:r>
         <w:rPr/>
         <w:t>x</w:t>
@@ -3056,15 +3483,15 @@
       <w:r>
         <w:rPr/>
       </w:r>
-      <w:commentRangeEnd w:id="1"/>
-      <w:r>
-        <w:commentReference w:id="1"/>
+      <w:commentRangeEnd w:id="6"/>
+      <w:r>
+        <w:commentReference w:id="6"/>
       </w:r>
       <w:r>
         <w:rPr/>
         <w:t xml:space="preserve"> reads were mapped, with a mean depth of </w:t>
       </w:r>
-      <w:commentRangeStart w:id="2"/>
+      <w:commentRangeStart w:id="7"/>
       <w:r>
         <w:rPr/>
         <w:t>y</w:t>
@@ -3072,15 +3499,15 @@
       <w:r>
         <w:rPr/>
       </w:r>
-      <w:commentRangeEnd w:id="2"/>
-      <w:r>
-        <w:commentReference w:id="2"/>
+      <w:commentRangeEnd w:id="7"/>
+      <w:r>
+        <w:commentReference w:id="7"/>
       </w:r>
       <w:r>
         <w:rPr/>
         <w:t xml:space="preserve">. There seemed to be no observable reference bias when comparing the numbers of mapped reads and the average mapping depth, which is further corroborated by very similar PCA results across all references </w:t>
       </w:r>
-      <w:commentRangeStart w:id="3"/>
+      <w:commentRangeStart w:id="8"/>
       <w:r>
         <w:rPr/>
         <w:t>(Supplementary Fig x)</w:t>
@@ -3088,9 +3515,9 @@
       <w:r>
         <w:rPr/>
       </w:r>
-      <w:commentRangeEnd w:id="3"/>
-      <w:r>
-        <w:commentReference w:id="3"/>
+      <w:commentRangeEnd w:id="8"/>
+      <w:r>
+        <w:commentReference w:id="8"/>
       </w:r>
       <w:r>
         <w:rPr/>
@@ -3138,7 +3565,7 @@
         </w:rPr>
         <w:t xml:space="preserve">). The distribution of insert sizes was very similar across methods </w:t>
       </w:r>
-      <w:commentRangeStart w:id="4"/>
+      <w:commentRangeStart w:id="9"/>
       <w:r>
         <w:rPr>
           <w:i w:val="false"/>
@@ -3152,9 +3579,9 @@
           <w:iCs w:val="false"/>
         </w:rPr>
       </w:r>
-      <w:commentRangeEnd w:id="4"/>
-      <w:r>
-        <w:commentReference w:id="4"/>
+      <w:commentRangeEnd w:id="9"/>
+      <w:r>
+        <w:commentReference w:id="9"/>
       </w:r>
       <w:r>
         <w:rPr>
@@ -3180,7 +3607,7 @@
         </w:rPr>
         <w:t xml:space="preserve">In total, </w:t>
       </w:r>
-      <w:commentRangeStart w:id="5"/>
+      <w:commentRangeStart w:id="10"/>
       <w:r>
         <w:rPr>
           <w:i w:val="false"/>
@@ -3194,9 +3621,9 @@
           <w:iCs w:val="false"/>
         </w:rPr>
       </w:r>
-      <w:commentRangeEnd w:id="5"/>
-      <w:r>
-        <w:commentReference w:id="5"/>
+      <w:commentRangeEnd w:id="10"/>
+      <w:r>
+        <w:commentReference w:id="10"/>
       </w:r>
       <w:r>
         <w:rPr>
@@ -3205,7 +3632,7 @@
         </w:rPr>
         <w:t xml:space="preserve"> variant sites were identified among all samples </w:t>
       </w:r>
-      <w:commentRangeStart w:id="6"/>
+      <w:commentRangeStart w:id="11"/>
       <w:r>
         <w:rPr>
           <w:i w:val="false"/>
@@ -3219,9 +3646,9 @@
           <w:iCs w:val="false"/>
         </w:rPr>
       </w:r>
-      <w:commentRangeEnd w:id="6"/>
-      <w:r>
-        <w:commentReference w:id="6"/>
+      <w:commentRangeEnd w:id="11"/>
+      <w:r>
+        <w:commentReference w:id="11"/>
       </w:r>
       <w:r>
         <w:rPr>
@@ -3230,7 +3657,7 @@
         </w:rPr>
         <w:t xml:space="preserve"> prior to filtering. Of the 274 samples, </w:t>
       </w:r>
-      <w:commentRangeStart w:id="7"/>
+      <w:commentRangeStart w:id="12"/>
       <w:r>
         <w:rPr>
           <w:i w:val="false"/>
@@ -3244,9 +3671,9 @@
           <w:iCs w:val="false"/>
         </w:rPr>
       </w:r>
-      <w:commentRangeEnd w:id="7"/>
-      <w:r>
-        <w:commentReference w:id="7"/>
+      <w:commentRangeEnd w:id="12"/>
+      <w:r>
+        <w:commentReference w:id="12"/>
       </w:r>
       <w:r>
         <w:rPr>
@@ -3255,7 +3682,7 @@
         </w:rPr>
         <w:t xml:space="preserve"> had over 10% of missing data across all loci and were therefore removed from the analysis </w:t>
       </w:r>
-      <w:commentRangeStart w:id="8"/>
+      <w:commentRangeStart w:id="13"/>
       <w:r>
         <w:rPr>
           <w:i w:val="false"/>
@@ -3269,9 +3696,9 @@
           <w:iCs w:val="false"/>
         </w:rPr>
       </w:r>
-      <w:commentRangeEnd w:id="8"/>
-      <w:r>
-        <w:commentReference w:id="8"/>
+      <w:commentRangeEnd w:id="13"/>
+      <w:r>
+        <w:commentReference w:id="13"/>
       </w:r>
       <w:r>
         <w:rPr>
@@ -3280,7 +3707,7 @@
         </w:rPr>
         <w:t xml:space="preserve">. Similarly, </w:t>
       </w:r>
-      <w:commentRangeStart w:id="9"/>
+      <w:commentRangeStart w:id="14"/>
       <w:r>
         <w:rPr>
           <w:i w:val="false"/>
@@ -3294,9 +3721,9 @@
           <w:iCs w:val="false"/>
         </w:rPr>
       </w:r>
-      <w:commentRangeEnd w:id="9"/>
-      <w:r>
-        <w:commentReference w:id="9"/>
+      <w:commentRangeEnd w:id="14"/>
+      <w:r>
+        <w:commentReference w:id="14"/>
       </w:r>
       <w:r>
         <w:rPr>
@@ -3305,7 +3732,7 @@
         </w:rPr>
         <w:t xml:space="preserve"> loci were missing in over 10% of all samples and were filtered out, resulting in a grand total of </w:t>
       </w:r>
-      <w:commentRangeStart w:id="10"/>
+      <w:commentRangeStart w:id="15"/>
       <w:r>
         <w:rPr>
           <w:i w:val="false"/>
@@ -3319,9 +3746,9 @@
           <w:iCs w:val="false"/>
         </w:rPr>
       </w:r>
-      <w:commentRangeEnd w:id="10"/>
-      <w:r>
-        <w:commentReference w:id="10"/>
+      <w:commentRangeEnd w:id="15"/>
+      <w:r>
+        <w:commentReference w:id="15"/>
       </w:r>
       <w:r>
         <w:rPr>
@@ -3330,7 +3757,7 @@
         </w:rPr>
         <w:t xml:space="preserve">. There was no clear pattern of method-associated per-locus missing data in the filtered loci and samples </w:t>
       </w:r>
-      <w:commentRangeStart w:id="11"/>
+      <w:commentRangeStart w:id="16"/>
       <w:r>
         <w:rPr>
           <w:i w:val="false"/>
@@ -3344,9 +3771,9 @@
           <w:iCs w:val="false"/>
         </w:rPr>
       </w:r>
-      <w:commentRangeEnd w:id="11"/>
-      <w:r>
-        <w:commentReference w:id="11"/>
+      <w:commentRangeEnd w:id="16"/>
+      <w:r>
+        <w:commentReference w:id="16"/>
       </w:r>
       <w:r>
         <w:rPr>
@@ -3355,7 +3782,7 @@
         </w:rPr>
         <w:t xml:space="preserve">, which indicates a successful combination of the ddRAD and 3RAD datasets. Furthermore, the variance of the number of recovered variant loci among all possible reference genomes was very low </w:t>
       </w:r>
-      <w:commentRangeStart w:id="12"/>
+      <w:commentRangeStart w:id="17"/>
       <w:r>
         <w:rPr>
           <w:i w:val="false"/>
@@ -3369,9 +3796,9 @@
           <w:iCs w:val="false"/>
         </w:rPr>
       </w:r>
-      <w:commentRangeEnd w:id="12"/>
-      <w:r>
-        <w:commentReference w:id="12"/>
+      <w:commentRangeEnd w:id="17"/>
+      <w:r>
+        <w:commentReference w:id="17"/>
       </w:r>
       <w:r>
         <w:rPr>
@@ -3395,11 +3822,7 @@
       <w:bookmarkEnd w:id="35"/>
       <w:r>
         <w:rPr/>
-        <w:t xml:space="preserve">5.2 Population </w:t>
-      </w:r>
-      <w:r>
-        <w:rPr/>
-        <w:t>genomics</w:t>
+        <w:t>5.2 Population genomics</w:t>
       </w:r>
     </w:p>
     <w:p>
@@ -3411,7 +3834,7 @@
         <w:rPr/>
         <w:t xml:space="preserve">The PCA analysis converged after </w:t>
       </w:r>
-      <w:commentRangeStart w:id="13"/>
+      <w:commentRangeStart w:id="18"/>
       <w:r>
         <w:rPr/>
         <w:t>x</w:t>
@@ -3419,15 +3842,15 @@
       <w:r>
         <w:rPr/>
       </w:r>
-      <w:commentRangeEnd w:id="13"/>
-      <w:r>
-        <w:commentReference w:id="13"/>
+      <w:commentRangeEnd w:id="18"/>
+      <w:r>
+        <w:commentReference w:id="18"/>
       </w:r>
       <w:r>
         <w:rPr/>
         <w:t xml:space="preserve"> generations and decomposed the variance of the data into</w:t>
       </w:r>
-      <w:commentRangeStart w:id="14"/>
+      <w:commentRangeStart w:id="19"/>
       <w:r>
         <w:rPr/>
         <w:t xml:space="preserve"> y</w:t>
@@ -3435,15 +3858,15 @@
       <w:r>
         <w:rPr/>
       </w:r>
-      <w:commentRangeEnd w:id="14"/>
-      <w:r>
-        <w:commentReference w:id="14"/>
+      <w:commentRangeEnd w:id="19"/>
+      <w:r>
+        <w:commentReference w:id="19"/>
       </w:r>
       <w:r>
         <w:rPr/>
         <w:t xml:space="preserve"> principal components, with the first two components accounting for </w:t>
       </w:r>
-      <w:commentRangeStart w:id="15"/>
+      <w:commentRangeStart w:id="20"/>
       <w:r>
         <w:rPr/>
         <w:t>k%</w:t>
@@ -3451,15 +3874,15 @@
       <w:r>
         <w:rPr/>
       </w:r>
-      <w:commentRangeEnd w:id="15"/>
-      <w:r>
-        <w:commentReference w:id="15"/>
+      <w:commentRangeEnd w:id="20"/>
+      <w:r>
+        <w:commentReference w:id="20"/>
       </w:r>
       <w:r>
         <w:rPr/>
         <w:t xml:space="preserve"> of the total variance </w:t>
       </w:r>
-      <w:commentRangeStart w:id="16"/>
+      <w:commentRangeStart w:id="21"/>
       <w:r>
         <w:rPr/>
         <w:t>(Fig x, Supplementary Figure y)</w:t>
@@ -3467,15 +3890,15 @@
       <w:r>
         <w:rPr/>
       </w:r>
-      <w:commentRangeEnd w:id="16"/>
-      <w:r>
-        <w:commentReference w:id="16"/>
+      <w:commentRangeEnd w:id="21"/>
+      <w:r>
+        <w:commentReference w:id="21"/>
       </w:r>
       <w:r>
         <w:rPr/>
         <w:t xml:space="preserve">. Overall, the structure observed in the PCA follows some pre-established expectations </w:t>
       </w:r>
-      <w:commentRangeStart w:id="17"/>
+      <w:commentRangeStart w:id="22"/>
       <w:r>
         <w:rPr/>
         <w:t>(Fig x)</w:t>
@@ -3483,9 +3906,9 @@
       <w:r>
         <w:rPr/>
       </w:r>
-      <w:commentRangeEnd w:id="17"/>
-      <w:r>
-        <w:commentReference w:id="17"/>
+      <w:commentRangeEnd w:id="22"/>
+      <w:r>
+        <w:commentReference w:id="22"/>
       </w:r>
       <w:r>
         <w:rPr/>
@@ -3527,21 +3950,7 @@
           <w:i w:val="false"/>
           <w:iCs w:val="false"/>
         </w:rPr>
-        <w:t xml:space="preserve"> value of five, although a value of four – reflecting the number of parental species among our samples – seems to be </w:t>
-      </w:r>
-      <w:r>
-        <w:rPr>
-          <w:i w:val="false"/>
-          <w:iCs w:val="false"/>
-        </w:rPr>
-        <w:t xml:space="preserve">similarly well </w:t>
-      </w:r>
-      <w:r>
-        <w:rPr>
-          <w:i w:val="false"/>
-          <w:iCs w:val="false"/>
-        </w:rPr>
-        <w:t xml:space="preserve">supported by </w:t>
+        <w:t xml:space="preserve"> value of five, although a value of four – reflecting the number of parental species among our samples – seems to be similarly well supported by </w:t>
       </w:r>
       <w:r>
         <w:rPr>
@@ -3557,7 +3966,7 @@
         </w:rPr>
         <w:t xml:space="preserve"> </w:t>
       </w:r>
-      <w:commentRangeStart w:id="18"/>
+      <w:commentRangeStart w:id="23"/>
       <w:r>
         <w:rPr>
           <w:i w:val="false"/>
@@ -3571,30 +3980,16 @@
           <w:iCs w:val="false"/>
         </w:rPr>
       </w:r>
-      <w:commentRangeEnd w:id="18"/>
-      <w:r>
-        <w:commentReference w:id="18"/>
-      </w:r>
-      <w:r>
-        <w:rPr>
-          <w:i w:val="false"/>
-          <w:iCs w:val="false"/>
-        </w:rPr>
-        <w:t xml:space="preserve">. </w:t>
-      </w:r>
-      <w:r>
-        <w:rPr>
-          <w:i w:val="false"/>
-          <w:iCs w:val="false"/>
-        </w:rPr>
-        <w:t>Nevertheless, for</w:t>
-      </w:r>
-      <w:r>
-        <w:rPr>
-          <w:i w:val="false"/>
-          <w:iCs w:val="false"/>
-        </w:rPr>
-        <w:t xml:space="preserve"> both values of </w:t>
+      <w:commentRangeEnd w:id="23"/>
+      <w:r>
+        <w:commentReference w:id="23"/>
+      </w:r>
+      <w:r>
+        <w:rPr>
+          <w:i w:val="false"/>
+          <w:iCs w:val="false"/>
+        </w:rPr>
+        <w:t xml:space="preserve">. Nevertheless, for both values of </w:t>
       </w:r>
       <w:r>
         <w:rPr>
@@ -3608,21 +4003,7 @@
           <w:i w:val="false"/>
           <w:iCs w:val="false"/>
         </w:rPr>
-        <w:t xml:space="preserve"> we observed a similar structure to that revealed by the PCA, with clusters of all four parental species </w:t>
-      </w:r>
-      <w:r>
-        <w:rPr>
-          <w:i w:val="false"/>
-          <w:iCs w:val="false"/>
-        </w:rPr>
-        <w:t>appearing</w:t>
-      </w:r>
-      <w:r>
-        <w:rPr>
-          <w:i w:val="false"/>
-          <w:iCs w:val="false"/>
-        </w:rPr>
-        <w:t xml:space="preserve"> at </w:t>
+        <w:t xml:space="preserve"> we observed a similar structure to that revealed by the PCA, with clusters of all four parental species appearing at </w:t>
       </w:r>
       <w:r>
         <w:rPr>
@@ -3636,51 +4017,9 @@
           <w:i w:val="false"/>
           <w:iCs w:val="false"/>
         </w:rPr>
-        <w:t xml:space="preserve">= 4 </w:t>
-      </w:r>
-      <w:r>
-        <w:rPr>
-          <w:i w:val="false"/>
-          <w:iCs w:val="false"/>
-        </w:rPr>
-        <w:t>together</w:t>
-      </w:r>
-      <w:r>
-        <w:rPr>
-          <w:i w:val="false"/>
-          <w:iCs w:val="false"/>
-        </w:rPr>
-        <w:t xml:space="preserve"> </w:t>
-      </w:r>
-      <w:r>
-        <w:rPr>
-          <w:i w:val="false"/>
-          <w:iCs w:val="false"/>
-        </w:rPr>
-        <w:t xml:space="preserve">with </w:t>
-      </w:r>
-      <w:r>
-        <w:rPr>
-          <w:i w:val="false"/>
-          <w:iCs w:val="false"/>
-        </w:rPr>
-        <w:t xml:space="preserve">F1 hybrids and </w:t>
-      </w:r>
-      <w:r>
-        <w:rPr>
-          <w:i w:val="false"/>
-          <w:iCs w:val="false"/>
-        </w:rPr>
-        <w:t xml:space="preserve">potential </w:t>
-      </w:r>
-      <w:r>
-        <w:rPr>
-          <w:i w:val="false"/>
-          <w:iCs w:val="false"/>
-        </w:rPr>
-        <w:t xml:space="preserve">backcrosses </w:t>
-      </w:r>
-      <w:commentRangeStart w:id="19"/>
+        <w:t xml:space="preserve">= 4 together with F1 hybrids and potential backcrosses </w:t>
+      </w:r>
+      <w:commentRangeStart w:id="24"/>
       <w:r>
         <w:rPr>
           <w:i w:val="false"/>
@@ -3694,58 +4033,16 @@
           <w:iCs w:val="false"/>
         </w:rPr>
       </w:r>
-      <w:commentRangeEnd w:id="19"/>
-      <w:r>
-        <w:commentReference w:id="19"/>
-      </w:r>
-      <w:r>
-        <w:rPr>
-          <w:i w:val="false"/>
-          <w:iCs w:val="false"/>
-        </w:rPr>
-        <w:t xml:space="preserve">, </w:t>
-      </w:r>
-      <w:r>
-        <w:rPr>
-          <w:i w:val="false"/>
-          <w:iCs w:val="false"/>
-        </w:rPr>
-        <w:t xml:space="preserve">all of </w:t>
-      </w:r>
-      <w:r>
-        <w:rPr>
-          <w:i w:val="false"/>
-          <w:iCs w:val="false"/>
-        </w:rPr>
-        <w:t xml:space="preserve">which </w:t>
-      </w:r>
-      <w:r>
-        <w:rPr>
-          <w:i w:val="false"/>
-          <w:iCs w:val="false"/>
-        </w:rPr>
-        <w:t>appear</w:t>
-      </w:r>
-      <w:r>
-        <w:rPr>
-          <w:i w:val="false"/>
-          <w:iCs w:val="false"/>
-        </w:rPr>
-        <w:t xml:space="preserve"> with </w:t>
-      </w:r>
-      <w:r>
-        <w:rPr>
-          <w:i w:val="false"/>
-          <w:iCs w:val="false"/>
-        </w:rPr>
-        <w:t>roughly</w:t>
-      </w:r>
-      <w:r>
-        <w:rPr>
-          <w:i w:val="false"/>
-          <w:iCs w:val="false"/>
-        </w:rPr>
-        <w:t xml:space="preserve"> the same ancestry proportions at </w:t>
+      <w:commentRangeEnd w:id="24"/>
+      <w:r>
+        <w:commentReference w:id="24"/>
+      </w:r>
+      <w:r>
+        <w:rPr>
+          <w:i w:val="false"/>
+          <w:iCs w:val="false"/>
+        </w:rPr>
+        <w:t xml:space="preserve">, all of which appear with roughly the same ancestry proportions at </w:t>
       </w:r>
       <w:r>
         <w:rPr>
@@ -3761,7 +4058,7 @@
         </w:rPr>
         <w:t xml:space="preserve">= 5 </w:t>
       </w:r>
-      <w:commentRangeStart w:id="20"/>
+      <w:commentRangeStart w:id="25"/>
       <w:r>
         <w:rPr>
           <w:i w:val="false"/>
@@ -3775,28 +4072,447 @@
           <w:iCs w:val="false"/>
         </w:rPr>
       </w:r>
-      <w:commentRangeEnd w:id="20"/>
-      <w:r>
-        <w:commentReference w:id="20"/>
-      </w:r>
-      <w:r>
-        <w:rPr>
-          <w:i w:val="false"/>
-          <w:iCs w:val="false"/>
-        </w:rPr>
-        <w:t xml:space="preserve">, showing the robustness of the </w:t>
-      </w:r>
-      <w:r>
-        <w:rPr>
-          <w:i w:val="false"/>
-          <w:iCs w:val="false"/>
-        </w:rPr>
-        <w:t>result</w:t>
-      </w:r>
-      <w:r>
-        <w:rPr>
-          <w:i w:val="false"/>
-          <w:iCs w:val="false"/>
+      <w:commentRangeEnd w:id="25"/>
+      <w:r>
+        <w:commentReference w:id="25"/>
+      </w:r>
+      <w:r>
+        <w:rPr>
+          <w:i w:val="false"/>
+          <w:iCs w:val="false"/>
+        </w:rPr>
+        <w:t>, showing the robustness of the result.</w:t>
+      </w:r>
+    </w:p>
+    <w:p>
+      <w:pPr>
+        <w:pStyle w:val="BodyTextFirstIndent"/>
+        <w:rPr/>
+      </w:pPr>
+      <w:r>
+        <w:rPr>
+          <w:i w:val="false"/>
+          <w:iCs w:val="false"/>
+        </w:rPr>
+        <w:t xml:space="preserve">Interestingly, at </w:t>
+      </w:r>
+      <w:r>
+        <w:rPr>
+          <w:i/>
+          <w:iCs/>
+        </w:rPr>
+        <w:t xml:space="preserve">K </w:t>
+      </w:r>
+      <w:r>
+        <w:rPr>
+          <w:i w:val="false"/>
+          <w:iCs w:val="false"/>
+        </w:rPr>
+        <w:t xml:space="preserve">= 5 we observe the separation of the </w:t>
+      </w:r>
+      <w:r>
+        <w:rPr>
+          <w:i/>
+          <w:iCs/>
+        </w:rPr>
+        <w:t>C. caretta</w:t>
+      </w:r>
+      <w:r>
+        <w:rPr>
+          <w:i w:val="false"/>
+          <w:iCs w:val="false"/>
+        </w:rPr>
+        <w:t xml:space="preserve"> cluster into two distinct ancestry components (Fig Xb). This reflects a previously described population structuring of the </w:t>
+      </w:r>
+      <w:r>
+        <w:rPr/>
+        <w:t>loggerhead</w:t>
+      </w:r>
+      <w:r>
+        <w:rPr>
+          <w:i w:val="false"/>
+          <w:iCs w:val="false"/>
+        </w:rPr>
+        <w:t xml:space="preserve"> populations along the Brazilian coast, associated with the Rio Grande Rise (RGR) feeding area </w:t>
+      </w:r>
+      <w:r>
+        <w:rPr>
+          <w:i w:val="false"/>
+          <w:iCs w:val="false"/>
+          <w:shd w:fill="FFFF00" w:val="clear"/>
+        </w:rPr>
+        <w:t>(Ref)</w:t>
+      </w:r>
+      <w:r>
+        <w:rPr>
+          <w:i w:val="false"/>
+          <w:iCs w:val="false"/>
+          <w:shd w:fill="auto" w:val="clear"/>
+        </w:rPr>
+        <w:t xml:space="preserve">. The Rio Grande Rise </w:t>
+      </w:r>
+      <w:commentRangeStart w:id="26"/>
+      <w:r>
+        <w:rPr>
+          <w:i w:val="false"/>
+          <w:iCs w:val="false"/>
+          <w:shd w:fill="auto" w:val="clear"/>
+        </w:rPr>
+        <w:t>(Fig)</w:t>
+      </w:r>
+      <w:r>
+        <w:rPr>
+          <w:i w:val="false"/>
+          <w:iCs w:val="false"/>
+          <w:shd w:fill="auto" w:val="clear"/>
+        </w:rPr>
+      </w:r>
+      <w:commentRangeEnd w:id="26"/>
+      <w:r>
+        <w:commentReference w:id="26"/>
+      </w:r>
+      <w:r>
+        <w:rPr>
+          <w:i w:val="false"/>
+          <w:iCs w:val="false"/>
+          <w:shd w:fill="auto" w:val="clear"/>
+        </w:rPr>
+        <w:t xml:space="preserve"> is an </w:t>
+      </w:r>
+      <w:commentRangeStart w:id="27"/>
+      <w:r>
+        <w:rPr>
+          <w:i w:val="false"/>
+          <w:iCs w:val="false"/>
+          <w:shd w:fill="auto" w:val="clear"/>
+        </w:rPr>
+        <w:t>elevated oceanic plateau</w:t>
+      </w:r>
+      <w:r>
+        <w:rPr>
+          <w:i w:val="false"/>
+          <w:iCs w:val="false"/>
+          <w:shd w:fill="auto" w:val="clear"/>
+        </w:rPr>
+      </w:r>
+      <w:commentRangeEnd w:id="27"/>
+      <w:r>
+        <w:commentReference w:id="27"/>
+      </w:r>
+      <w:r>
+        <w:rPr>
+          <w:i w:val="false"/>
+          <w:iCs w:val="false"/>
+          <w:shd w:fill="auto" w:val="clear"/>
+        </w:rPr>
+        <w:t xml:space="preserve"> located in the southeastern part of the Atlantic Ocean, outside the Brazilian exclusive economical zone </w:t>
+      </w:r>
+      <w:r>
+        <w:rPr>
+          <w:i w:val="false"/>
+          <w:iCs w:val="false"/>
+          <w:shd w:fill="FFFF00" w:val="clear"/>
+        </w:rPr>
+        <w:t>(Ref)</w:t>
+      </w:r>
+      <w:r>
+        <w:rPr>
+          <w:i w:val="false"/>
+          <w:iCs w:val="false"/>
+          <w:shd w:fill="auto" w:val="clear"/>
+        </w:rPr>
+        <w:t xml:space="preserve">. It is well-known to be a feeding area for many populations of </w:t>
+      </w:r>
+      <w:r>
+        <w:rPr>
+          <w:i/>
+          <w:iCs/>
+          <w:shd w:fill="auto" w:val="clear"/>
+        </w:rPr>
+        <w:t>C. caretta</w:t>
+      </w:r>
+      <w:r>
+        <w:rPr>
+          <w:i w:val="false"/>
+          <w:iCs w:val="false"/>
+          <w:shd w:fill="auto" w:val="clear"/>
+        </w:rPr>
+        <w:t xml:space="preserve"> from across the globe </w:t>
+      </w:r>
+      <w:r>
+        <w:rPr>
+          <w:i w:val="false"/>
+          <w:iCs w:val="false"/>
+          <w:shd w:fill="FFFF00" w:val="clear"/>
+        </w:rPr>
+        <w:t>(Ref)</w:t>
+      </w:r>
+      <w:r>
+        <w:rPr>
+          <w:i w:val="false"/>
+          <w:iCs w:val="false"/>
+          <w:shd w:fill="auto" w:val="clear"/>
+        </w:rPr>
+        <w:t xml:space="preserve">, where mature adults of these different populations are known to interbreed </w:t>
+      </w:r>
+      <w:r>
+        <w:rPr>
+          <w:i w:val="false"/>
+          <w:iCs w:val="false"/>
+          <w:shd w:fill="FFFF00" w:val="clear"/>
+        </w:rPr>
+        <w:t>(Ref)</w:t>
+      </w:r>
+      <w:r>
+        <w:rPr>
+          <w:i w:val="false"/>
+          <w:iCs w:val="false"/>
+          <w:shd w:fill="auto" w:val="clear"/>
+        </w:rPr>
+        <w:t xml:space="preserve">. Some of the offspring of these individuals could be phylopatric to the nesting areas of the Brazilian parentals, a behaviour previously described for the hybrid offspring of loggerheads X hawksbills </w:t>
+      </w:r>
+      <w:commentRangeStart w:id="28"/>
+      <w:r>
+        <w:rPr>
+          <w:i w:val="false"/>
+          <w:iCs w:val="false"/>
+          <w:shd w:fill="auto" w:val="clear"/>
+        </w:rPr>
+        <w:t>(Ref)</w:t>
+      </w:r>
+      <w:r>
+        <w:rPr>
+          <w:i w:val="false"/>
+          <w:iCs w:val="false"/>
+          <w:shd w:fill="auto" w:val="clear"/>
+        </w:rPr>
+      </w:r>
+      <w:commentRangeEnd w:id="28"/>
+      <w:r>
+        <w:commentReference w:id="28"/>
+      </w:r>
+      <w:r>
+        <w:rPr>
+          <w:i w:val="false"/>
+          <w:iCs w:val="false"/>
+          <w:shd w:fill="auto" w:val="clear"/>
+        </w:rPr>
+        <w:t xml:space="preserve">, thus explaining the observed structuring in our data. Moreover, some of our samples were collected from individuals captured at or in the vicinity of the RGR </w:t>
+      </w:r>
+      <w:bookmarkStart w:id="36" w:name="ZOTERO_BREF_HIWosQ0aWPU8"/>
+      <w:r>
+        <w:rPr>
+          <w:i w:val="false"/>
+          <w:iCs w:val="false"/>
+          <w:shd w:fill="auto" w:val="clear"/>
+        </w:rPr>
+        <w:t>(2, 3)</w:t>
+      </w:r>
+      <w:bookmarkEnd w:id="36"/>
+      <w:r>
+        <w:rPr>
+          <w:i w:val="false"/>
+          <w:iCs w:val="false"/>
+          <w:shd w:fill="auto" w:val="clear"/>
+        </w:rPr>
+        <w:t>, corroborating the observed population structure.</w:t>
+      </w:r>
+    </w:p>
+    <w:p>
+      <w:pPr>
+        <w:pStyle w:val="BodyTextFirstIndent"/>
+        <w:rPr>
+          <w:i w:val="false"/>
+          <w:i w:val="false"/>
+          <w:iCs w:val="false"/>
+          <w:shd w:fill="auto" w:val="clear"/>
+        </w:rPr>
+      </w:pPr>
+      <w:r>
+        <w:rPr>
+          <w:i w:val="false"/>
+          <w:iCs w:val="false"/>
+          <w:shd w:fill="auto" w:val="clear"/>
+        </w:rPr>
+        <w:t xml:space="preserve">Another noteworthy finding is the observation of individuals of the olive ridley that seem to be either introgressed with the green turtle, or backcrosses between F1 hybrids of those two species and an olive ridley parental, evidenced in </w:t>
+      </w:r>
+      <w:r>
+        <w:rPr>
+          <w:i/>
+          <w:iCs/>
+          <w:shd w:fill="auto" w:val="clear"/>
+        </w:rPr>
+        <w:t>K</w:t>
+      </w:r>
+      <w:r>
+        <w:rPr>
+          <w:i w:val="false"/>
+          <w:iCs w:val="false"/>
+          <w:shd w:fill="auto" w:val="clear"/>
+        </w:rPr>
+        <w:t xml:space="preserve"> = 4 and </w:t>
+      </w:r>
+      <w:r>
+        <w:rPr>
+          <w:i/>
+          <w:iCs/>
+          <w:shd w:fill="auto" w:val="clear"/>
+        </w:rPr>
+        <w:t>K</w:t>
+      </w:r>
+      <w:r>
+        <w:rPr>
+          <w:i w:val="false"/>
+          <w:iCs w:val="false"/>
+          <w:shd w:fill="auto" w:val="clear"/>
+        </w:rPr>
+        <w:t xml:space="preserve"> = 5 </w:t>
+      </w:r>
+      <w:commentRangeStart w:id="29"/>
+      <w:r>
+        <w:rPr>
+          <w:i w:val="false"/>
+          <w:iCs w:val="false"/>
+          <w:shd w:fill="auto" w:val="clear"/>
+        </w:rPr>
+        <w:t>(Fig)</w:t>
+      </w:r>
+      <w:r>
+        <w:rPr>
+          <w:i w:val="false"/>
+          <w:iCs w:val="false"/>
+          <w:shd w:fill="auto" w:val="clear"/>
+        </w:rPr>
+      </w:r>
+      <w:commentRangeEnd w:id="29"/>
+      <w:r>
+        <w:commentReference w:id="29"/>
+      </w:r>
+      <w:r>
+        <w:rPr>
+          <w:i w:val="false"/>
+          <w:iCs w:val="false"/>
+          <w:shd w:fill="auto" w:val="clear"/>
+        </w:rPr>
+        <w:t xml:space="preserve">. The reason why this result is particularly remarkable stems from the fact that the estimated divergence time between </w:t>
+      </w:r>
+      <w:r>
+        <w:rPr>
+          <w:i/>
+          <w:iCs/>
+          <w:shd w:fill="auto" w:val="clear"/>
+        </w:rPr>
+        <w:t>C. mydas</w:t>
+      </w:r>
+      <w:r>
+        <w:rPr>
+          <w:i w:val="false"/>
+          <w:iCs w:val="false"/>
+          <w:shd w:fill="auto" w:val="clear"/>
+        </w:rPr>
+        <w:t xml:space="preserve"> and the clade containing </w:t>
+      </w:r>
+      <w:r>
+        <w:rPr>
+          <w:i/>
+          <w:iCs/>
+          <w:shd w:fill="auto" w:val="clear"/>
+        </w:rPr>
+        <w:t>C. caretta</w:t>
+      </w:r>
+      <w:r>
+        <w:rPr>
+          <w:i w:val="false"/>
+          <w:iCs w:val="false"/>
+          <w:shd w:fill="auto" w:val="clear"/>
+        </w:rPr>
+        <w:t xml:space="preserve"> and the genus </w:t>
+      </w:r>
+      <w:r>
+        <w:rPr>
+          <w:i/>
+          <w:iCs/>
+          <w:shd w:fill="auto" w:val="clear"/>
+        </w:rPr>
+        <w:t xml:space="preserve">Lepidochelys </w:t>
+      </w:r>
+      <w:r>
+        <w:rPr>
+          <w:i w:val="false"/>
+          <w:iCs w:val="false"/>
+          <w:shd w:fill="auto" w:val="clear"/>
+        </w:rPr>
+        <w:t xml:space="preserve">is of about 40 Mya </w:t>
+      </w:r>
+      <w:r>
+        <w:rPr>
+          <w:i w:val="false"/>
+          <w:iCs w:val="false"/>
+          <w:shd w:fill="FFFF00" w:val="clear"/>
+        </w:rPr>
+        <w:t>(Ref)</w:t>
+      </w:r>
+      <w:r>
+        <w:rPr>
+          <w:i w:val="false"/>
+          <w:iCs w:val="false"/>
+          <w:shd w:fill="auto" w:val="clear"/>
+        </w:rPr>
+        <w:t xml:space="preserve">, a length of time at which successful hybridisation among vertebrate species is usually unexpected – although the formation of hybrids between species with even older divergence times is observed in sturgeons in lab settings </w:t>
+      </w:r>
+      <w:commentRangeStart w:id="30"/>
+      <w:r>
+        <w:rPr>
+          <w:i w:val="false"/>
+          <w:iCs w:val="false"/>
+          <w:shd w:fill="auto" w:val="clear"/>
+        </w:rPr>
+        <w:t>(Ref)</w:t>
+      </w:r>
+      <w:r>
+        <w:rPr>
+          <w:i w:val="false"/>
+          <w:iCs w:val="false"/>
+          <w:shd w:fill="auto" w:val="clear"/>
+        </w:rPr>
+      </w:r>
+      <w:commentRangeEnd w:id="30"/>
+      <w:r>
+        <w:commentReference w:id="30"/>
+      </w:r>
+      <w:r>
+        <w:rPr>
+          <w:i w:val="false"/>
+          <w:iCs w:val="false"/>
+          <w:shd w:fill="auto" w:val="clear"/>
+        </w:rPr>
+        <w:t xml:space="preserve"> and gars in nature </w:t>
+      </w:r>
+      <w:commentRangeStart w:id="31"/>
+      <w:r>
+        <w:rPr>
+          <w:i w:val="false"/>
+          <w:iCs w:val="false"/>
+          <w:shd w:fill="auto" w:val="clear"/>
+        </w:rPr>
+        <w:t>(Ref)</w:t>
+      </w:r>
+      <w:r>
+        <w:rPr>
+          <w:i w:val="false"/>
+          <w:iCs w:val="false"/>
+          <w:shd w:fill="auto" w:val="clear"/>
+        </w:rPr>
+      </w:r>
+      <w:commentRangeEnd w:id="31"/>
+      <w:r>
+        <w:commentReference w:id="31"/>
+      </w:r>
+      <w:r>
+        <w:rPr>
+          <w:i w:val="false"/>
+          <w:iCs w:val="false"/>
+          <w:shd w:fill="auto" w:val="clear"/>
         </w:rPr>
         <w:t>.</w:t>
       </w:r>
@@ -3810,27 +4526,15 @@
         <w:rPr>
           <w:i w:val="false"/>
           <w:iCs w:val="false"/>
-        </w:rPr>
-        <w:t xml:space="preserve">Interestingly, at </w:t>
-      </w:r>
-      <w:r>
-        <w:rPr>
-          <w:i/>
-          <w:iCs/>
-        </w:rPr>
-        <w:t xml:space="preserve">K </w:t>
-      </w:r>
-      <w:r>
-        <w:rPr>
-          <w:i w:val="false"/>
-          <w:iCs w:val="false"/>
-        </w:rPr>
-        <w:t xml:space="preserve">= 5 we observe the separation of the </w:t>
-      </w:r>
-      <w:r>
-        <w:rPr>
-          <w:i/>
-          <w:iCs/>
+          <w:shd w:fill="auto" w:val="clear"/>
+        </w:rPr>
+        <w:t xml:space="preserve">Lastly, we also found evidences of samples to seem to be hybrids between three different species (henceforth called “triple hybrids”), namely the loggerhead </w:t>
+      </w:r>
+      <w:r>
+        <w:rPr>
+          <w:i/>
+          <w:iCs/>
+          <w:shd w:fill="auto" w:val="clear"/>
         </w:rPr>
         <w:t>C. caretta</w:t>
       </w:r>
@@ -3838,19 +4542,33 @@
         <w:rPr>
           <w:i w:val="false"/>
           <w:iCs w:val="false"/>
-        </w:rPr>
-        <w:t xml:space="preserve"> cluster into two distinct ancestry components (Fig Xb). This reflects a previously described population structuring of the </w:t>
-      </w:r>
-      <w:r>
-        <w:rPr/>
-        <w:t>loggerhead</w:t>
-      </w:r>
-      <w:r>
-        <w:rPr>
-          <w:i w:val="false"/>
-          <w:iCs w:val="false"/>
-        </w:rPr>
-        <w:t xml:space="preserve"> populations along the Brazilian coast, associated with the Rio Grande Rise (RGR) feeding area </w:t>
+          <w:shd w:fill="auto" w:val="clear"/>
+        </w:rPr>
+        <w:t xml:space="preserve">, the hawksbill </w:t>
+      </w:r>
+      <w:r>
+        <w:rPr>
+          <w:i/>
+          <w:iCs/>
+          <w:shd w:fill="auto" w:val="clear"/>
+        </w:rPr>
+        <w:t xml:space="preserve">E. imbricata </w:t>
+      </w:r>
+      <w:r>
+        <w:rPr>
+          <w:i w:val="false"/>
+          <w:iCs w:val="false"/>
+          <w:shd w:fill="auto" w:val="clear"/>
+        </w:rPr>
+        <w:t xml:space="preserve">and the green turtle </w:t>
+      </w:r>
+      <w:r>
+        <w:rPr>
+          <w:i/>
+          <w:iCs/>
+          <w:shd w:fill="auto" w:val="clear"/>
+        </w:rPr>
+        <w:t xml:space="preserve">C. mydas </w:t>
       </w:r>
       <w:r>
         <w:rPr>
@@ -3858,6 +4576,38 @@
           <w:iCs w:val="false"/>
           <w:shd w:fill="FFFF00" w:val="clear"/>
         </w:rPr>
+        <w:t>(Fig)</w:t>
+      </w:r>
+      <w:r>
+        <w:rPr>
+          <w:i w:val="false"/>
+          <w:iCs w:val="false"/>
+          <w:shd w:fill="auto" w:val="clear"/>
+        </w:rPr>
+        <w:t xml:space="preserve">. This result is observed at both values of </w:t>
+      </w:r>
+      <w:r>
+        <w:rPr>
+          <w:i/>
+          <w:iCs/>
+          <w:shd w:fill="auto" w:val="clear"/>
+        </w:rPr>
+        <w:t>K</w:t>
+      </w:r>
+      <w:r>
+        <w:rPr>
+          <w:i w:val="false"/>
+          <w:iCs w:val="false"/>
+          <w:shd w:fill="auto" w:val="clear"/>
+        </w:rPr>
+        <w:t xml:space="preserve">, and it corroborates previous findings where a subset of the same data was analysed within a smaller scope and without a high-quality reference genome for alignment </w:t>
+      </w:r>
+      <w:r>
+        <w:rPr>
+          <w:i w:val="false"/>
+          <w:iCs w:val="false"/>
+          <w:shd w:fill="FFFF00" w:val="clear"/>
+        </w:rPr>
         <w:t>(Ref)</w:t>
       </w:r>
       <w:r>
@@ -3866,562 +4616,39 @@
           <w:iCs w:val="false"/>
           <w:shd w:fill="auto" w:val="clear"/>
         </w:rPr>
-        <w:t xml:space="preserve">. The Rio Grande Rise </w:t>
-      </w:r>
-      <w:commentRangeStart w:id="21"/>
+        <w:t xml:space="preserve">. Perhaps most notably is the fact that these supposed triple hybrids have an almost perfect proportion of all three ancestry components, a result that could be expected to arise from the backcross of an F1 hybrid with a third parental species. It would presumably be highly informative to understand the order of those putative crossings as that could shed light into the viability and compatibility aspects of sea turtle hybrids, although this information is currently lacking. Perhaps, combining the genomic data with mitochondrial haplotypes could help resolve this conundrum. Yet, these results in particular must be taken with care, since these suspected triple hybrids are among the samples with a high degree of missing data </w:t>
+      </w:r>
+      <w:r>
+        <w:rPr>
+          <w:i w:val="false"/>
+          <w:iCs w:val="false"/>
+          <w:shd w:fill="FFFF00" w:val="clear"/>
+        </w:rPr>
+        <w:t>(Fig/Table/Sup)</w:t>
+      </w:r>
       <w:r>
         <w:rPr>
           <w:i w:val="false"/>
           <w:iCs w:val="false"/>
           <w:shd w:fill="auto" w:val="clear"/>
         </w:rPr>
-        <w:t>(Fig)</w:t>
-      </w:r>
-      <w:r>
-        <w:rPr>
-          <w:i w:val="false"/>
-          <w:iCs w:val="false"/>
-          <w:shd w:fill="auto" w:val="clear"/>
-        </w:rPr>
-      </w:r>
-      <w:commentRangeEnd w:id="21"/>
-      <w:r>
-        <w:commentReference w:id="21"/>
-      </w:r>
-      <w:r>
-        <w:rPr>
-          <w:i w:val="false"/>
-          <w:iCs w:val="false"/>
-          <w:shd w:fill="auto" w:val="clear"/>
-        </w:rPr>
-        <w:t xml:space="preserve"> is an </w:t>
-      </w:r>
-      <w:commentRangeStart w:id="22"/>
-      <w:r>
-        <w:rPr>
-          <w:i w:val="false"/>
-          <w:iCs w:val="false"/>
-          <w:shd w:fill="auto" w:val="clear"/>
-        </w:rPr>
-        <w:t>elevated oceanic plateau</w:t>
-      </w:r>
-      <w:r>
-        <w:rPr>
-          <w:i w:val="false"/>
-          <w:iCs w:val="false"/>
-          <w:shd w:fill="auto" w:val="clear"/>
-        </w:rPr>
-      </w:r>
-      <w:commentRangeEnd w:id="22"/>
-      <w:r>
-        <w:commentReference w:id="22"/>
-      </w:r>
-      <w:r>
-        <w:rPr>
-          <w:i w:val="false"/>
-          <w:iCs w:val="false"/>
-          <w:shd w:fill="auto" w:val="clear"/>
-        </w:rPr>
-        <w:t xml:space="preserve"> located in the southeastern part of the Atlantic Ocean, outside the Brazilian exclusive economical zone </w:t>
-      </w:r>
-      <w:r>
-        <w:rPr>
-          <w:i w:val="false"/>
-          <w:iCs w:val="false"/>
-          <w:shd w:fill="FFFF00" w:val="clear"/>
-        </w:rPr>
-        <w:t>(Ref)</w:t>
-      </w:r>
-      <w:r>
-        <w:rPr>
-          <w:i w:val="false"/>
-          <w:iCs w:val="false"/>
-          <w:shd w:fill="auto" w:val="clear"/>
-        </w:rPr>
-        <w:t xml:space="preserve">. It is well-known to be a feeding area for many populations of </w:t>
-      </w:r>
-      <w:r>
-        <w:rPr>
-          <w:i/>
-          <w:iCs/>
-          <w:shd w:fill="auto" w:val="clear"/>
-        </w:rPr>
-        <w:t>C. caretta</w:t>
-      </w:r>
-      <w:r>
-        <w:rPr>
-          <w:i w:val="false"/>
-          <w:iCs w:val="false"/>
-          <w:shd w:fill="auto" w:val="clear"/>
-        </w:rPr>
-        <w:t xml:space="preserve"> from across the globe </w:t>
-      </w:r>
-      <w:r>
-        <w:rPr>
-          <w:i w:val="false"/>
-          <w:iCs w:val="false"/>
-          <w:shd w:fill="FFFF00" w:val="clear"/>
-        </w:rPr>
-        <w:t>(Ref)</w:t>
-      </w:r>
-      <w:r>
-        <w:rPr>
-          <w:i w:val="false"/>
-          <w:iCs w:val="false"/>
-          <w:shd w:fill="auto" w:val="clear"/>
-        </w:rPr>
-        <w:t xml:space="preserve">, where mature adults of these </w:t>
-      </w:r>
-      <w:r>
-        <w:rPr>
-          <w:i w:val="false"/>
-          <w:iCs w:val="false"/>
-          <w:shd w:fill="auto" w:val="clear"/>
-        </w:rPr>
-        <w:t>different</w:t>
-      </w:r>
-      <w:r>
-        <w:rPr>
-          <w:i w:val="false"/>
-          <w:iCs w:val="false"/>
-          <w:shd w:fill="auto" w:val="clear"/>
-        </w:rPr>
-        <w:t xml:space="preserve"> populations </w:t>
-      </w:r>
-      <w:r>
-        <w:rPr>
-          <w:i w:val="false"/>
-          <w:iCs w:val="false"/>
-          <w:shd w:fill="auto" w:val="clear"/>
-        </w:rPr>
-        <w:t>are known to interbreed</w:t>
-      </w:r>
-      <w:r>
-        <w:rPr>
-          <w:i w:val="false"/>
-          <w:iCs w:val="false"/>
-          <w:shd w:fill="auto" w:val="clear"/>
-        </w:rPr>
-        <w:t xml:space="preserve"> </w:t>
-      </w:r>
-      <w:r>
-        <w:rPr>
-          <w:i w:val="false"/>
-          <w:iCs w:val="false"/>
-          <w:shd w:fill="FFFF00" w:val="clear"/>
-        </w:rPr>
-        <w:t>(Ref)</w:t>
-      </w:r>
-      <w:r>
-        <w:rPr>
-          <w:i w:val="false"/>
-          <w:iCs w:val="false"/>
-          <w:shd w:fill="auto" w:val="clear"/>
-        </w:rPr>
-        <w:t xml:space="preserve">. Some of the offspring of these individuals could be phylopatric to the nesting areas of the Brazilian parentals, </w:t>
-      </w:r>
-      <w:r>
-        <w:rPr>
-          <w:i w:val="false"/>
-          <w:iCs w:val="false"/>
-          <w:shd w:fill="auto" w:val="clear"/>
-        </w:rPr>
-        <w:t xml:space="preserve">a behaviour previously described for the hybrid offspring of loggerheads X hawksbills </w:t>
-      </w:r>
-      <w:commentRangeStart w:id="23"/>
-      <w:r>
-        <w:rPr>
-          <w:i w:val="false"/>
-          <w:iCs w:val="false"/>
-          <w:shd w:fill="auto" w:val="clear"/>
-        </w:rPr>
-        <w:t>(Ref)</w:t>
-      </w:r>
-      <w:r>
-        <w:rPr>
-          <w:i w:val="false"/>
-          <w:iCs w:val="false"/>
-          <w:shd w:fill="auto" w:val="clear"/>
-        </w:rPr>
-      </w:r>
-      <w:commentRangeEnd w:id="23"/>
-      <w:r>
-        <w:commentReference w:id="23"/>
-      </w:r>
-      <w:r>
-        <w:rPr>
-          <w:i w:val="false"/>
-          <w:iCs w:val="false"/>
-          <w:shd w:fill="auto" w:val="clear"/>
-        </w:rPr>
-        <w:t xml:space="preserve">, thus explaining the observed structuring in our data. Moreover, some of our samples were collected from individuals captured at or in the vicinity of the RGR </w:t>
-      </w:r>
-      <w:bookmarkStart w:id="36" w:name="ZOTERO_BREF_HIWosQ0aWPU8"/>
-      <w:r>
-        <w:rPr>
-          <w:i w:val="false"/>
-          <w:iCs w:val="false"/>
-          <w:shd w:fill="auto" w:val="clear"/>
-        </w:rPr>
-        <w:t>(2, 3)</w:t>
-      </w:r>
-      <w:bookmarkEnd w:id="36"/>
-      <w:r>
-        <w:rPr>
-          <w:i w:val="false"/>
-          <w:iCs w:val="false"/>
-          <w:shd w:fill="auto" w:val="clear"/>
-        </w:rPr>
-        <w:t xml:space="preserve">, </w:t>
-      </w:r>
-      <w:r>
-        <w:rPr>
-          <w:i w:val="false"/>
-          <w:iCs w:val="false"/>
-          <w:shd w:fill="auto" w:val="clear"/>
-        </w:rPr>
-        <w:t xml:space="preserve">corroborating </w:t>
-      </w:r>
-      <w:r>
-        <w:rPr>
-          <w:i w:val="false"/>
-          <w:iCs w:val="false"/>
-          <w:shd w:fill="auto" w:val="clear"/>
-        </w:rPr>
-        <w:t>the observed population structure.</w:t>
+        <w:t>.</w:t>
       </w:r>
     </w:p>
     <w:p>
       <w:pPr>
         <w:pStyle w:val="BodyTextFirstIndent"/>
-        <w:rPr>
-          <w:i w:val="false"/>
-          <w:i w:val="false"/>
-          <w:iCs w:val="false"/>
-          <w:shd w:fill="auto" w:val="clear"/>
-        </w:rPr>
-      </w:pPr>
-      <w:r>
-        <w:rPr>
-          <w:i w:val="false"/>
-          <w:iCs w:val="false"/>
-          <w:shd w:fill="auto" w:val="clear"/>
-        </w:rPr>
-        <w:t xml:space="preserve">Another noteworthy finding is the observation of individuals of the olive ridley that seem to be either introgressed with the green turtle, or backcrosses between F1 hybrids of those two species and an olive ridley parental, evidenced in </w:t>
-      </w:r>
-      <w:r>
-        <w:rPr>
-          <w:i/>
-          <w:iCs/>
-          <w:shd w:fill="auto" w:val="clear"/>
-        </w:rPr>
-        <w:t>K</w:t>
-      </w:r>
-      <w:r>
-        <w:rPr>
-          <w:i w:val="false"/>
-          <w:iCs w:val="false"/>
-          <w:shd w:fill="auto" w:val="clear"/>
-        </w:rPr>
-        <w:t xml:space="preserve"> = 4 and </w:t>
-      </w:r>
-      <w:r>
-        <w:rPr>
-          <w:i/>
-          <w:iCs/>
-          <w:shd w:fill="auto" w:val="clear"/>
-        </w:rPr>
-        <w:t>K</w:t>
-      </w:r>
-      <w:r>
-        <w:rPr>
-          <w:i w:val="false"/>
-          <w:iCs w:val="false"/>
-          <w:shd w:fill="auto" w:val="clear"/>
-        </w:rPr>
-        <w:t xml:space="preserve"> = 5 </w:t>
-      </w:r>
-      <w:commentRangeStart w:id="24"/>
-      <w:r>
-        <w:rPr>
-          <w:i w:val="false"/>
-          <w:iCs w:val="false"/>
-          <w:shd w:fill="auto" w:val="clear"/>
-        </w:rPr>
-        <w:t>(Fig)</w:t>
-      </w:r>
-      <w:r>
-        <w:rPr>
-          <w:i w:val="false"/>
-          <w:iCs w:val="false"/>
-          <w:shd w:fill="auto" w:val="clear"/>
-        </w:rPr>
-      </w:r>
-      <w:commentRangeEnd w:id="24"/>
-      <w:r>
-        <w:commentReference w:id="24"/>
-      </w:r>
-      <w:r>
-        <w:rPr>
-          <w:i w:val="false"/>
-          <w:iCs w:val="false"/>
-          <w:shd w:fill="auto" w:val="clear"/>
-        </w:rPr>
-        <w:t xml:space="preserve">. The reason why this result is particularly remarkable stems from the fact that the estimated divergence time between </w:t>
-      </w:r>
-      <w:r>
-        <w:rPr>
-          <w:i/>
-          <w:iCs/>
-          <w:shd w:fill="auto" w:val="clear"/>
-        </w:rPr>
-        <w:t>C. mydas</w:t>
-      </w:r>
-      <w:r>
-        <w:rPr>
-          <w:i w:val="false"/>
-          <w:iCs w:val="false"/>
-          <w:shd w:fill="auto" w:val="clear"/>
-        </w:rPr>
-        <w:t xml:space="preserve"> and the clade containing </w:t>
-      </w:r>
-      <w:r>
-        <w:rPr>
-          <w:i/>
-          <w:iCs/>
-          <w:shd w:fill="auto" w:val="clear"/>
-        </w:rPr>
-        <w:t>C. caretta</w:t>
-      </w:r>
-      <w:r>
-        <w:rPr>
-          <w:i w:val="false"/>
-          <w:iCs w:val="false"/>
-          <w:shd w:fill="auto" w:val="clear"/>
-        </w:rPr>
-        <w:t xml:space="preserve"> and the genus </w:t>
-      </w:r>
-      <w:r>
-        <w:rPr>
-          <w:i/>
-          <w:iCs/>
-          <w:shd w:fill="auto" w:val="clear"/>
-        </w:rPr>
-        <w:t xml:space="preserve">Lepidochelys </w:t>
-      </w:r>
-      <w:r>
-        <w:rPr>
-          <w:i w:val="false"/>
-          <w:iCs w:val="false"/>
-          <w:shd w:fill="auto" w:val="clear"/>
-        </w:rPr>
-        <w:t xml:space="preserve">is of about 40 Mya </w:t>
-      </w:r>
-      <w:r>
-        <w:rPr>
-          <w:i w:val="false"/>
-          <w:iCs w:val="false"/>
-          <w:shd w:fill="FFFF00" w:val="clear"/>
-        </w:rPr>
-        <w:t>(Ref)</w:t>
-      </w:r>
-      <w:r>
-        <w:rPr>
-          <w:i w:val="false"/>
-          <w:iCs w:val="false"/>
-          <w:shd w:fill="auto" w:val="clear"/>
-        </w:rPr>
-        <w:t xml:space="preserve">, a length of time at which successful hybridisation among vertebrate species is usually unexpected – although the formation of hybrids between species with even older divergence times is observed in sturgeons in lab settings </w:t>
-      </w:r>
-      <w:commentRangeStart w:id="25"/>
-      <w:r>
-        <w:rPr>
-          <w:i w:val="false"/>
-          <w:iCs w:val="false"/>
-          <w:shd w:fill="auto" w:val="clear"/>
-        </w:rPr>
-        <w:t>(Ref)</w:t>
-      </w:r>
-      <w:r>
-        <w:rPr>
-          <w:i w:val="false"/>
-          <w:iCs w:val="false"/>
-          <w:shd w:fill="auto" w:val="clear"/>
-        </w:rPr>
-      </w:r>
-      <w:commentRangeEnd w:id="25"/>
-      <w:r>
-        <w:commentReference w:id="25"/>
-      </w:r>
-      <w:r>
-        <w:rPr>
-          <w:i w:val="false"/>
-          <w:iCs w:val="false"/>
-          <w:shd w:fill="auto" w:val="clear"/>
-        </w:rPr>
-        <w:t xml:space="preserve"> and gars in nature </w:t>
-      </w:r>
-      <w:commentRangeStart w:id="26"/>
-      <w:r>
-        <w:rPr>
-          <w:i w:val="false"/>
-          <w:iCs w:val="false"/>
-          <w:shd w:fill="auto" w:val="clear"/>
-        </w:rPr>
-        <w:t>(Ref)</w:t>
-      </w:r>
-      <w:r>
-        <w:rPr>
-          <w:i w:val="false"/>
-          <w:iCs w:val="false"/>
-          <w:shd w:fill="auto" w:val="clear"/>
-        </w:rPr>
-      </w:r>
-      <w:commentRangeEnd w:id="26"/>
-      <w:r>
-        <w:commentReference w:id="26"/>
-      </w:r>
-      <w:r>
-        <w:rPr>
-          <w:i w:val="false"/>
-          <w:iCs w:val="false"/>
-          <w:shd w:fill="auto" w:val="clear"/>
-        </w:rPr>
-        <w:t>.</w:t>
+        <w:ind w:hanging="0" w:start="0"/>
+        <w:rPr/>
+      </w:pPr>
+      <w:r>
+        <w:rPr/>
       </w:r>
     </w:p>
     <w:p>
       <w:pPr>
         <w:pStyle w:val="BodyTextFirstIndent"/>
-        <w:rPr/>
-      </w:pPr>
-      <w:r>
-        <w:rPr>
-          <w:i w:val="false"/>
-          <w:iCs w:val="false"/>
-          <w:shd w:fill="auto" w:val="clear"/>
-        </w:rPr>
-        <w:t xml:space="preserve">Lastly, we also found evidences of samples to seem to be hybrids between three different species (henceforth called “triple hybrids”), namely the loggerhead </w:t>
-      </w:r>
-      <w:r>
-        <w:rPr>
-          <w:i/>
-          <w:iCs/>
-          <w:shd w:fill="auto" w:val="clear"/>
-        </w:rPr>
-        <w:t>C. caretta</w:t>
-      </w:r>
-      <w:r>
-        <w:rPr>
-          <w:i w:val="false"/>
-          <w:iCs w:val="false"/>
-          <w:shd w:fill="auto" w:val="clear"/>
-        </w:rPr>
-        <w:t xml:space="preserve">, the hawksbill </w:t>
-      </w:r>
-      <w:r>
-        <w:rPr>
-          <w:i/>
-          <w:iCs/>
-          <w:shd w:fill="auto" w:val="clear"/>
-        </w:rPr>
-        <w:t xml:space="preserve">E. imbricata </w:t>
-      </w:r>
-      <w:r>
-        <w:rPr>
-          <w:i w:val="false"/>
-          <w:iCs w:val="false"/>
-          <w:shd w:fill="auto" w:val="clear"/>
-        </w:rPr>
-        <w:t xml:space="preserve">and the green turtle </w:t>
-      </w:r>
-      <w:r>
-        <w:rPr>
-          <w:i/>
-          <w:iCs/>
-          <w:shd w:fill="auto" w:val="clear"/>
-        </w:rPr>
-        <w:t xml:space="preserve">C. mydas </w:t>
-      </w:r>
-      <w:r>
-        <w:rPr>
-          <w:i w:val="false"/>
-          <w:iCs w:val="false"/>
-          <w:shd w:fill="FFFF00" w:val="clear"/>
-        </w:rPr>
-        <w:t>(Fig)</w:t>
-      </w:r>
-      <w:r>
-        <w:rPr>
-          <w:i w:val="false"/>
-          <w:iCs w:val="false"/>
-          <w:shd w:fill="auto" w:val="clear"/>
-        </w:rPr>
-        <w:t xml:space="preserve">. This result is observed at both values of </w:t>
-      </w:r>
-      <w:r>
-        <w:rPr>
-          <w:i/>
-          <w:iCs/>
-          <w:shd w:fill="auto" w:val="clear"/>
-        </w:rPr>
-        <w:t>K</w:t>
-      </w:r>
-      <w:r>
-        <w:rPr>
-          <w:i w:val="false"/>
-          <w:iCs w:val="false"/>
-          <w:shd w:fill="auto" w:val="clear"/>
-        </w:rPr>
-        <w:t xml:space="preserve">, and it corroborates previous findings where a subset of the same data was analysed within a smaller scope and without a high-quality reference genome for alignment </w:t>
-      </w:r>
-      <w:r>
-        <w:rPr>
-          <w:i w:val="false"/>
-          <w:iCs w:val="false"/>
-          <w:shd w:fill="FFFF00" w:val="clear"/>
-        </w:rPr>
-        <w:t>(Ref)</w:t>
-      </w:r>
-      <w:r>
-        <w:rPr>
-          <w:i w:val="false"/>
-          <w:iCs w:val="false"/>
-          <w:shd w:fill="auto" w:val="clear"/>
-        </w:rPr>
-        <w:t xml:space="preserve">. Perhaps most notably is the fact that these supposed triple hybrids have an almost perfect proportion of all three ancestry components, a result that could be expected to arise from the backcross of an F1 hybrid with a third parental species. It would presumably be highly informative to understand the order of those putative crossings as that could shed light into the viability and compatibility aspects of sea turtle hybrids, although this information is currently lacking. Perhaps, combining the genomic data with mitochondrial haplotypes could help resolve this conundrum. Yet, these results in particular must be taken with care, since these suspected triple hybrids are among the samples with a high degree of missing data </w:t>
-      </w:r>
-      <w:r>
-        <w:rPr>
-          <w:i w:val="false"/>
-          <w:iCs w:val="false"/>
-          <w:shd w:fill="FFFF00" w:val="clear"/>
-        </w:rPr>
-        <w:t>(Fig/Table/Sup)</w:t>
-      </w:r>
-      <w:r>
-        <w:rPr>
-          <w:i w:val="false"/>
-          <w:iCs w:val="false"/>
-          <w:shd w:fill="auto" w:val="clear"/>
-        </w:rPr>
-        <w:t>.</w:t>
-      </w:r>
-    </w:p>
-    <w:p>
-      <w:pPr>
-        <w:pStyle w:val="BodyTextFirstIndent"/>
-        <w:ind w:hanging="0"/>
-        <w:rPr/>
-      </w:pPr>
-      <w:r>
-        <w:rPr/>
-      </w:r>
-    </w:p>
-    <w:p>
-      <w:pPr>
-        <w:pStyle w:val="BodyTextFirstIndent"/>
-        <w:ind w:hanging="0"/>
+        <w:ind w:hanging="0" w:start="0"/>
         <w:rPr/>
       </w:pPr>
       <w:r>
@@ -4585,6 +4812,7 @@
           <w:iCs w:val="false"/>
           <w:position w:val="0"/>
           <w:sz w:val="24"/>
+          <w:sz w:val="24"/>
           <w:vertAlign w:val="baseline"/>
         </w:rPr>
         <w:t xml:space="preserve">), which can be estimated by </w:t>
@@ -4595,6 +4823,7 @@
           <w:iCs/>
           <w:position w:val="0"/>
           <w:sz w:val="24"/>
+          <w:sz w:val="24"/>
           <w:vertAlign w:val="baseline"/>
         </w:rPr>
         <w:t>ANGSD</w:t>
@@ -4605,6 +4834,7 @@
           <w:iCs w:val="false"/>
           <w:position w:val="0"/>
           <w:sz w:val="24"/>
+          <w:sz w:val="24"/>
           <w:vertAlign w:val="baseline"/>
         </w:rPr>
         <w:t xml:space="preserve"> </w:t>
@@ -4614,6 +4844,7 @@
           <w:i w:val="false"/>
           <w:iCs w:val="false"/>
           <w:position w:val="0"/>
+          <w:sz w:val="24"/>
           <w:sz w:val="24"/>
           <w:shd w:fill="FFFF00" w:val="clear"/>
           <w:vertAlign w:val="baseline"/>
@@ -4626,6 +4857,7 @@
           <w:iCs w:val="false"/>
           <w:position w:val="0"/>
           <w:sz w:val="24"/>
+          <w:sz w:val="24"/>
           <w:vertAlign w:val="baseline"/>
         </w:rPr>
         <w:t xml:space="preserve"> using genotype likelihoods data. In addition to that, a phylogenetic tree estimated from variant data, such as the maximum-likelihood trees produced by </w:t>
@@ -4636,6 +4868,7 @@
           <w:iCs/>
           <w:position w:val="0"/>
           <w:sz w:val="24"/>
+          <w:sz w:val="24"/>
           <w:vertAlign w:val="baseline"/>
         </w:rPr>
         <w:t xml:space="preserve">IQ-Tree </w:t>
@@ -4645,6 +4878,7 @@
           <w:i w:val="false"/>
           <w:iCs w:val="false"/>
           <w:position w:val="0"/>
+          <w:sz w:val="24"/>
           <w:sz w:val="24"/>
           <w:shd w:fill="FFFF00" w:val="clear"/>
           <w:vertAlign w:val="baseline"/>
@@ -4657,6 +4891,7 @@
           <w:iCs w:val="false"/>
           <w:position w:val="0"/>
           <w:sz w:val="24"/>
+          <w:sz w:val="24"/>
           <w:vertAlign w:val="baseline"/>
         </w:rPr>
         <w:t xml:space="preserve"> could reflect a split between populations of </w:t>
@@ -4667,6 +4902,7 @@
           <w:iCs/>
           <w:position w:val="0"/>
           <w:sz w:val="24"/>
+          <w:sz w:val="24"/>
           <w:vertAlign w:val="baseline"/>
         </w:rPr>
         <w:t>C. caretta</w:t>
@@ -4677,6 +4913,7 @@
           <w:iCs w:val="false"/>
           <w:position w:val="0"/>
           <w:sz w:val="24"/>
+          <w:sz w:val="24"/>
           <w:vertAlign w:val="baseline"/>
         </w:rPr>
         <w:t>, thus corroborating our results.</w:t>
@@ -4697,6 +4934,7 @@
           <w:iCs w:val="false"/>
           <w:position w:val="0"/>
           <w:sz w:val="24"/>
+          <w:sz w:val="24"/>
           <w:vertAlign w:val="baseline"/>
         </w:rPr>
         <w:t>Still under objective one, it is important to consider and understand how past dynamics in regards to the population history of those species have shaped their genetic diversity and how this could be impacted by – or even help explain – the observed extent of hybridisation. We can achieve this by calculating the population-level genetic diversity, using metrics such as the nucleotide diversity (</w:t>
@@ -4708,6 +4946,7 @@
           <w:iCs/>
           <w:position w:val="0"/>
           <w:sz w:val="24"/>
+          <w:sz w:val="24"/>
           <w:vertAlign w:val="baseline"/>
         </w:rPr>
         <w:t>π</w:t>
@@ -4719,6 +4958,7 @@
           <w:iCs w:val="false"/>
           <w:position w:val="0"/>
           <w:sz w:val="24"/>
+          <w:sz w:val="24"/>
           <w:vertAlign w:val="baseline"/>
         </w:rPr>
         <w:t xml:space="preserve">), Tajima’s </w:t>
@@ -4730,6 +4970,7 @@
           <w:iCs/>
           <w:position w:val="0"/>
           <w:sz w:val="24"/>
+          <w:sz w:val="24"/>
           <w:vertAlign w:val="baseline"/>
         </w:rPr>
         <w:t>D</w:t>
@@ -4741,17 +4982,19 @@
           <w:iCs w:val="false"/>
           <w:position w:val="0"/>
           <w:sz w:val="24"/>
+          <w:sz w:val="24"/>
           <w:vertAlign w:val="baseline"/>
         </w:rPr>
         <w:t xml:space="preserve"> test of neutrality and the Watterson estimator of genetic diversity (</w:t>
       </w:r>
       <w:r>
         <w:rPr>
-          <w:rFonts w:eastAsia="Noto Serif CJK SC" w:cs="Noto Sans Devanagari" w:ascii="Times New Roman" w:hAnsi="Times New Roman"/>
+          <w:rFonts w:eastAsia="Noto Serif CJK SC" w:cs="Noto Sans Devanagari"/>
           <w:i/>
           <w:iCs/>
           <w:position w:val="0"/>
           <w:sz w:val="24"/>
+          <w:sz w:val="24"/>
           <w:vertAlign w:val="baseline"/>
         </w:rPr>
         <w:t>θ</w:t>
@@ -4763,6 +5006,7 @@
           <w:iCs w:val="false"/>
           <w:position w:val="0"/>
           <w:sz w:val="24"/>
+          <w:sz w:val="24"/>
           <w:vertAlign w:val="baseline"/>
         </w:rPr>
         <w:t xml:space="preserve">), all of which can be calculated using genotype likelihoods in </w:t>
@@ -4774,6 +5018,7 @@
           <w:iCs/>
           <w:position w:val="0"/>
           <w:sz w:val="24"/>
+          <w:sz w:val="24"/>
           <w:vertAlign w:val="baseline"/>
         </w:rPr>
         <w:t>ANGSD</w:t>
@@ -4785,6 +5030,7 @@
           <w:iCs w:val="false"/>
           <w:position w:val="0"/>
           <w:sz w:val="24"/>
+          <w:sz w:val="24"/>
           <w:vertAlign w:val="baseline"/>
         </w:rPr>
         <w:t xml:space="preserve"> </w:t>
@@ -4795,6 +5041,7 @@
           <w:i w:val="false"/>
           <w:iCs w:val="false"/>
           <w:position w:val="0"/>
+          <w:sz w:val="24"/>
           <w:sz w:val="24"/>
           <w:shd w:fill="FFFF00" w:val="clear"/>
           <w:vertAlign w:val="baseline"/>
@@ -4808,11 +5055,12 @@
           <w:iCs w:val="false"/>
           <w:position w:val="0"/>
           <w:sz w:val="24"/>
+          <w:sz w:val="24"/>
           <w:vertAlign w:val="baseline"/>
         </w:rPr>
         <w:t xml:space="preserve">. Moreover, we can also model the historical effective population size, as well as events of population contraction and expansion using coalescent </w:t>
       </w:r>
-      <w:commentRangeStart w:id="27"/>
+      <w:commentRangeStart w:id="32"/>
       <w:r>
         <w:rPr>
           <w:rFonts w:eastAsia="Noto Serif CJK SC" w:cs="Noto Sans Devanagari"/>
@@ -4820,6 +5068,7 @@
           <w:iCs w:val="false"/>
           <w:position w:val="0"/>
           <w:sz w:val="24"/>
+          <w:sz w:val="24"/>
           <w:vertAlign w:val="baseline"/>
         </w:rPr>
         <w:t>(Ref)</w:t>
@@ -4831,12 +5080,13 @@
           <w:iCs w:val="false"/>
           <w:position w:val="0"/>
           <w:sz w:val="24"/>
+          <w:sz w:val="24"/>
           <w:vertAlign w:val="baseline"/>
         </w:rPr>
       </w:r>
-      <w:commentRangeEnd w:id="27"/>
-      <w:r>
-        <w:commentReference w:id="27"/>
+      <w:commentRangeEnd w:id="32"/>
+      <w:r>
+        <w:commentReference w:id="32"/>
       </w:r>
       <w:r>
         <w:rPr>
@@ -4845,11 +5095,12 @@
           <w:iCs w:val="false"/>
           <w:position w:val="0"/>
           <w:sz w:val="24"/>
+          <w:sz w:val="24"/>
           <w:vertAlign w:val="baseline"/>
         </w:rPr>
         <w:t xml:space="preserve"> and one-population frequency spectrum-based models </w:t>
       </w:r>
-      <w:commentRangeStart w:id="28"/>
+      <w:commentRangeStart w:id="33"/>
       <w:r>
         <w:rPr>
           <w:rFonts w:eastAsia="Noto Serif CJK SC" w:cs="Noto Sans Devanagari"/>
@@ -4857,6 +5108,7 @@
           <w:iCs w:val="false"/>
           <w:position w:val="0"/>
           <w:sz w:val="24"/>
+          <w:sz w:val="24"/>
           <w:vertAlign w:val="baseline"/>
         </w:rPr>
         <w:t>(Ref)</w:t>
@@ -4868,12 +5120,13 @@
           <w:iCs w:val="false"/>
           <w:position w:val="0"/>
           <w:sz w:val="24"/>
+          <w:sz w:val="24"/>
           <w:vertAlign w:val="baseline"/>
         </w:rPr>
       </w:r>
-      <w:commentRangeEnd w:id="28"/>
-      <w:r>
-        <w:commentReference w:id="28"/>
+      <w:commentRangeEnd w:id="33"/>
+      <w:r>
+        <w:commentReference w:id="33"/>
       </w:r>
       <w:r>
         <w:rPr>
@@ -4882,6 +5135,7 @@
           <w:iCs w:val="false"/>
           <w:position w:val="0"/>
           <w:sz w:val="24"/>
+          <w:sz w:val="24"/>
           <w:vertAlign w:val="baseline"/>
         </w:rPr>
         <w:t>.</w:t>
@@ -4930,7 +5184,7 @@
         </w:rPr>
         <w:t xml:space="preserve">, as well as by analysing the distribution of genetic diversity and genetic distance metrics in windows along the genome. For additional analyses, such as the identification of large blocks of homozygous ancestry (“runs of homozygosity”), we would need a more contiguous set of genomic data, which can be achieved by performing a whole-genome re-sequencing of a set of thoughtfully selected samples. This would also enable the analysis of high-resolution genome-wise ancestry variation </w:t>
       </w:r>
-      <w:commentRangeStart w:id="29"/>
+      <w:commentRangeStart w:id="34"/>
       <w:r>
         <w:rPr>
           <w:rFonts w:eastAsia="Noto Serif CJK SC" w:cs="Noto Sans Devanagari"/>
@@ -4946,9 +5200,9 @@
           <w:iCs w:val="false"/>
         </w:rPr>
       </w:r>
-      <w:commentRangeEnd w:id="29"/>
-      <w:r>
-        <w:commentReference w:id="29"/>
+      <w:commentRangeEnd w:id="34"/>
+      <w:r>
+        <w:commentReference w:id="34"/>
       </w:r>
       <w:r>
         <w:rPr>
@@ -4958,7 +5212,7 @@
         </w:rPr>
         <w:t xml:space="preserve">, which can help identify target loci for further investigation. Once a set of loci has been selected, we could then make use of the existing genomic annotation for the reference genomes </w:t>
       </w:r>
-      <w:commentRangeStart w:id="30"/>
+      <w:commentRangeStart w:id="35"/>
       <w:r>
         <w:rPr>
           <w:rFonts w:eastAsia="Noto Serif CJK SC" w:cs="Noto Sans Devanagari"/>
@@ -4974,9 +5228,9 @@
           <w:iCs w:val="false"/>
         </w:rPr>
       </w:r>
-      <w:commentRangeEnd w:id="30"/>
-      <w:r>
-        <w:commentReference w:id="30"/>
+      <w:commentRangeEnd w:id="35"/>
+      <w:r>
+        <w:commentReference w:id="35"/>
       </w:r>
       <w:r>
         <w:rPr>
@@ -5169,10 +5423,85 @@
 
 <file path=word/comments.xml><?xml version="1.0" encoding="utf-8"?>
 <w:comments xmlns:o="urn:schemas-microsoft-com:office:office" xmlns:r="http://schemas.openxmlformats.org/officeDocument/2006/relationships" xmlns:v="urn:schemas-microsoft-com:vml" xmlns:w="http://schemas.openxmlformats.org/wordprocessingml/2006/main" xmlns:w10="urn:schemas-microsoft-com:office:word" xmlns:wp="http://schemas.openxmlformats.org/drawingml/2006/wordprocessingDrawing" xmlns:pic="http://schemas.openxmlformats.org/drawingml/2006/picture" xmlns:wps="http://schemas.microsoft.com/office/word/2010/wordprocessingShape" xmlns:wpg="http://schemas.microsoft.com/office/word/2010/wordprocessingGroup" xmlns:mc="http://schemas.openxmlformats.org/markup-compatibility/2006" xmlns:wp14="http://schemas.microsoft.com/office/word/2010/wordprocessingDrawing" xmlns:w14="http://schemas.microsoft.com/office/word/2010/wordml" xmlns:w15="http://schemas.microsoft.com/office/word/2012/wordml" mc:Ignorable="w14 wp14 w15">
-  <w:comment w:id="0" w:author="Unknown Author" w:date="2025-04-14T12:46:53Z" w:initials="">
-    <w:p>
-      <w:pPr>
-        <w:overflowPunct w:val="true"/>
+  <w:comment w:id="0" w:author="Maycon Oliveira" w:date="2025-05-03T17:04:12Z" w:initials="MO">
+    <w:p>
+      <w:pPr>
+        <w:overflowPunct w:val="false"/>
+        <w:rPr/>
+      </w:pPr>
+      <w:r>
+        <w:rPr>
+          <w:rFonts w:cs="Tahoma" w:eastAsia="Segoe UI"/>
+          <w:lang w:bidi="en-US" w:eastAsia="en-US" w:val="en-US"/>
+        </w:rPr>
+        <w:t>Evolution (Futuyma) and ricardo’s paper</w:t>
+      </w:r>
+    </w:p>
+  </w:comment>
+  <w:comment w:id="1" w:author="Maycon Oliveira" w:date="2025-05-03T17:08:08Z" w:initials="MO">
+    <w:p>
+      <w:pPr>
+        <w:overflowPunct w:val="false"/>
+        <w:rPr/>
+      </w:pPr>
+      <w:r>
+        <w:rPr>
+          <w:rFonts w:cs="Tahoma" w:eastAsia="Segoe UI"/>
+          <w:lang w:bidi="en-US" w:eastAsia="en-US" w:val="en-US"/>
+        </w:rPr>
+        <w:t>Ricardo’s paper, at least one other ref, ideally an older one</w:t>
+      </w:r>
+    </w:p>
+  </w:comment>
+  <w:comment w:id="2" w:author="Maycon Oliveira" w:date="2025-05-03T17:11:59Z" w:initials="MO">
+    <w:p>
+      <w:pPr>
+        <w:overflowPunct w:val="false"/>
+        <w:rPr/>
+      </w:pPr>
+      <w:r>
+        <w:rPr>
+          <w:rFonts w:cs="Tahoma" w:eastAsia="Segoe UI"/>
+          <w:lang w:bidi="en-US" w:eastAsia="en-US" w:val="en-US"/>
+        </w:rPr>
+        <w:t>Evolution book should be sufficient, maybe cite Ridley?</w:t>
+      </w:r>
+    </w:p>
+  </w:comment>
+  <w:comment w:id="3" w:author="Maycon Oliveira" w:date="2025-05-03T17:45:43Z" w:initials="MO">
+    <w:p>
+      <w:pPr>
+        <w:overflowPunct w:val="false"/>
+        <w:rPr/>
+      </w:pPr>
+      <w:r>
+        <w:rPr>
+          <w:rFonts w:cs="Tahoma" w:eastAsia="Segoe UI"/>
+          <w:lang w:bidi="en-US" w:eastAsia="en-US" w:val="en-US"/>
+        </w:rPr>
+        <w:t>Some evolution book + kimura neutralism</w:t>
+      </w:r>
+    </w:p>
+  </w:comment>
+  <w:comment w:id="4" w:author="Maycon Oliveira" w:date="2025-05-03T19:20:41Z" w:initials="MO">
+    <w:p>
+      <w:pPr>
+        <w:overflowPunct w:val="false"/>
+        <w:rPr/>
+      </w:pPr>
+      <w:r>
+        <w:rPr>
+          <w:rFonts w:cs="Tahoma" w:eastAsia="Segoe UI"/>
+          <w:lang w:bidi="en-US" w:eastAsia="en-US" w:val="en-US"/>
+        </w:rPr>
+        <w:t>Get the cow paper</w:t>
+      </w:r>
+    </w:p>
+  </w:comment>
+  <w:comment w:id="5" w:author="Unknown Author" w:date="2025-04-14T12:46:53Z" w:initials="">
+    <w:p>
+      <w:pPr>
+        <w:overflowPunct w:val="false"/>
         <w:rPr/>
       </w:pPr>
       <w:r>
@@ -5184,10 +5513,10 @@
       </w:r>
     </w:p>
   </w:comment>
-  <w:comment w:id="1" w:author="Unknown Author" w:date="2025-04-14T12:45:54Z" w:initials="">
-    <w:p>
-      <w:pPr>
-        <w:overflowPunct w:val="true"/>
+  <w:comment w:id="6" w:author="Unknown Author" w:date="2025-04-14T12:45:54Z" w:initials="">
+    <w:p>
+      <w:pPr>
+        <w:overflowPunct w:val="false"/>
         <w:rPr/>
       </w:pPr>
       <w:r>
@@ -5199,10 +5528,10 @@
       </w:r>
     </w:p>
   </w:comment>
-  <w:comment w:id="2" w:author="Unknown Author" w:date="2025-04-14T12:46:08Z" w:initials="">
-    <w:p>
-      <w:pPr>
-        <w:overflowPunct w:val="true"/>
+  <w:comment w:id="7" w:author="Unknown Author" w:date="2025-04-14T12:46:08Z" w:initials="">
+    <w:p>
+      <w:pPr>
+        <w:overflowPunct w:val="false"/>
         <w:rPr/>
       </w:pPr>
       <w:r>
@@ -5214,10 +5543,10 @@
       </w:r>
     </w:p>
   </w:comment>
-  <w:comment w:id="3" w:author="Unknown Author" w:date="2025-04-14T12:46:21Z" w:initials="">
-    <w:p>
-      <w:pPr>
-        <w:overflowPunct w:val="true"/>
+  <w:comment w:id="8" w:author="Unknown Author" w:date="2025-04-14T12:46:21Z" w:initials="">
+    <w:p>
+      <w:pPr>
+        <w:overflowPunct w:val="false"/>
         <w:rPr/>
       </w:pPr>
       <w:r>
@@ -5229,10 +5558,10 @@
       </w:r>
     </w:p>
   </w:comment>
-  <w:comment w:id="4" w:author="Unknown Author" w:date="2025-04-15T13:01:01Z" w:initials="">
-    <w:p>
-      <w:pPr>
-        <w:overflowPunct w:val="false"/>
+  <w:comment w:id="9" w:author="Unknown Author" w:date="2025-04-15T13:01:01Z" w:initials="">
+    <w:p>
+      <w:pPr>
+        <w:overflowPunct w:val="true"/>
         <w:rPr/>
       </w:pPr>
       <w:r>
@@ -5244,10 +5573,10 @@
       </w:r>
     </w:p>
   </w:comment>
-  <w:comment w:id="5" w:author="Unknown Author" w:date="2025-04-15T13:40:37Z" w:initials="">
-    <w:p>
-      <w:pPr>
-        <w:overflowPunct w:val="false"/>
+  <w:comment w:id="10" w:author="Unknown Author" w:date="2025-04-15T13:40:37Z" w:initials="">
+    <w:p>
+      <w:pPr>
+        <w:overflowPunct w:val="true"/>
         <w:rPr/>
       </w:pPr>
       <w:r>
@@ -5259,10 +5588,10 @@
       </w:r>
     </w:p>
   </w:comment>
-  <w:comment w:id="6" w:author="Unknown Author" w:date="2025-04-15T13:40:47Z" w:initials="">
-    <w:p>
-      <w:pPr>
-        <w:overflowPunct w:val="false"/>
+  <w:comment w:id="11" w:author="Unknown Author" w:date="2025-04-15T13:40:47Z" w:initials="">
+    <w:p>
+      <w:pPr>
+        <w:overflowPunct w:val="true"/>
         <w:rPr/>
       </w:pPr>
       <w:r>
@@ -5274,10 +5603,10 @@
       </w:r>
     </w:p>
   </w:comment>
-  <w:comment w:id="7" w:author="Unknown Author" w:date="2025-04-15T14:59:15Z" w:initials="">
-    <w:p>
-      <w:pPr>
-        <w:overflowPunct w:val="false"/>
+  <w:comment w:id="12" w:author="Unknown Author" w:date="2025-04-15T14:59:15Z" w:initials="">
+    <w:p>
+      <w:pPr>
+        <w:overflowPunct w:val="true"/>
         <w:rPr/>
       </w:pPr>
       <w:r>
@@ -5289,10 +5618,10 @@
       </w:r>
     </w:p>
   </w:comment>
-  <w:comment w:id="8" w:author="Unknown Author" w:date="2025-04-15T14:59:36Z" w:initials="">
-    <w:p>
-      <w:pPr>
-        <w:overflowPunct w:val="false"/>
+  <w:comment w:id="13" w:author="Unknown Author" w:date="2025-04-15T14:59:36Z" w:initials="">
+    <w:p>
+      <w:pPr>
+        <w:overflowPunct w:val="true"/>
         <w:rPr/>
       </w:pPr>
       <w:r>
@@ -5304,10 +5633,10 @@
       </w:r>
     </w:p>
   </w:comment>
-  <w:comment w:id="9" w:author="Unknown Author" w:date="2025-04-15T15:02:33Z" w:initials="">
-    <w:p>
-      <w:pPr>
-        <w:overflowPunct w:val="false"/>
+  <w:comment w:id="14" w:author="Unknown Author" w:date="2025-04-15T15:02:33Z" w:initials="">
+    <w:p>
+      <w:pPr>
+        <w:overflowPunct w:val="true"/>
         <w:rPr/>
       </w:pPr>
       <w:r>
@@ -5319,10 +5648,10 @@
       </w:r>
     </w:p>
   </w:comment>
-  <w:comment w:id="10" w:author="Unknown Author" w:date="2025-04-15T15:03:44Z" w:initials="">
-    <w:p>
-      <w:pPr>
-        <w:overflowPunct w:val="false"/>
+  <w:comment w:id="15" w:author="Unknown Author" w:date="2025-04-15T15:03:44Z" w:initials="">
+    <w:p>
+      <w:pPr>
+        <w:overflowPunct w:val="true"/>
         <w:rPr/>
       </w:pPr>
       <w:r>
@@ -5334,10 +5663,10 @@
       </w:r>
     </w:p>
   </w:comment>
-  <w:comment w:id="11" w:author="Unknown Author" w:date="2025-04-15T15:07:14Z" w:initials="">
-    <w:p>
-      <w:pPr>
-        <w:overflowPunct w:val="false"/>
+  <w:comment w:id="16" w:author="Unknown Author" w:date="2025-04-15T15:07:14Z" w:initials="">
+    <w:p>
+      <w:pPr>
+        <w:overflowPunct w:val="true"/>
         <w:rPr/>
       </w:pPr>
       <w:r>
@@ -5349,10 +5678,10 @@
       </w:r>
     </w:p>
   </w:comment>
-  <w:comment w:id="12" w:author="Unknown Author" w:date="2025-04-15T15:08:39Z" w:initials="">
-    <w:p>
-      <w:pPr>
-        <w:overflowPunct w:val="false"/>
+  <w:comment w:id="17" w:author="Unknown Author" w:date="2025-04-15T15:08:39Z" w:initials="">
+    <w:p>
+      <w:pPr>
+        <w:overflowPunct w:val="true"/>
         <w:rPr/>
       </w:pPr>
       <w:r>
@@ -5364,10 +5693,10 @@
       </w:r>
     </w:p>
   </w:comment>
-  <w:comment w:id="13" w:author="Unknown Author" w:date="2025-04-15T15:13:28Z" w:initials="">
-    <w:p>
-      <w:pPr>
-        <w:overflowPunct w:val="false"/>
+  <w:comment w:id="18" w:author="Unknown Author" w:date="2025-04-15T15:13:28Z" w:initials="">
+    <w:p>
+      <w:pPr>
+        <w:overflowPunct w:val="true"/>
         <w:rPr/>
       </w:pPr>
       <w:r>
@@ -5379,10 +5708,10 @@
       </w:r>
     </w:p>
   </w:comment>
-  <w:comment w:id="14" w:author="Unknown Author" w:date="2025-04-15T15:15:24Z" w:initials="">
-    <w:p>
-      <w:pPr>
-        <w:overflowPunct w:val="false"/>
+  <w:comment w:id="19" w:author="Unknown Author" w:date="2025-04-15T15:15:24Z" w:initials="">
+    <w:p>
+      <w:pPr>
+        <w:overflowPunct w:val="true"/>
         <w:rPr/>
       </w:pPr>
       <w:r>
@@ -5394,10 +5723,10 @@
       </w:r>
     </w:p>
   </w:comment>
-  <w:comment w:id="15" w:author="Unknown Author" w:date="2025-04-15T15:15:36Z" w:initials="">
-    <w:p>
-      <w:pPr>
-        <w:overflowPunct w:val="false"/>
+  <w:comment w:id="20" w:author="Unknown Author" w:date="2025-04-15T15:15:36Z" w:initials="">
+    <w:p>
+      <w:pPr>
+        <w:overflowPunct w:val="true"/>
         <w:rPr/>
       </w:pPr>
       <w:r>
@@ -5409,10 +5738,10 @@
       </w:r>
     </w:p>
   </w:comment>
-  <w:comment w:id="16" w:author="Unknown Author" w:date="2025-04-15T15:15:55Z" w:initials="">
-    <w:p>
-      <w:pPr>
-        <w:overflowPunct w:val="false"/>
+  <w:comment w:id="21" w:author="Unknown Author" w:date="2025-04-15T15:15:55Z" w:initials="">
+    <w:p>
+      <w:pPr>
+        <w:overflowPunct w:val="true"/>
         <w:rPr/>
       </w:pPr>
       <w:r>
@@ -5424,10 +5753,10 @@
       </w:r>
     </w:p>
   </w:comment>
-  <w:comment w:id="17" w:author="Maycon Oliveira" w:date="2025-04-15T15:26:05Z" w:initials="MO">
-    <w:p>
-      <w:pPr>
-        <w:overflowPunct w:val="false"/>
+  <w:comment w:id="22" w:author="Maycon Oliveira" w:date="2025-04-15T15:26:05Z" w:initials="MO">
+    <w:p>
+      <w:pPr>
+        <w:overflowPunct w:val="true"/>
         <w:rPr/>
       </w:pPr>
       <w:r>
@@ -5439,10 +5768,10 @@
       </w:r>
     </w:p>
   </w:comment>
-  <w:comment w:id="18" w:author="Maycon Oliveira" w:date="2025-04-15T15:29:58Z" w:initials="MO">
-    <w:p>
-      <w:pPr>
-        <w:overflowPunct w:val="false"/>
+  <w:comment w:id="23" w:author="Maycon Oliveira" w:date="2025-04-15T15:29:58Z" w:initials="MO">
+    <w:p>
+      <w:pPr>
+        <w:overflowPunct w:val="true"/>
         <w:rPr/>
       </w:pPr>
       <w:r>
@@ -5454,10 +5783,10 @@
       </w:r>
     </w:p>
   </w:comment>
-  <w:comment w:id="19" w:author="Maycon Oliveira" w:date="2025-04-15T15:33:13Z" w:initials="MO">
-    <w:p>
-      <w:pPr>
-        <w:overflowPunct w:val="false"/>
+  <w:comment w:id="24" w:author="Maycon Oliveira" w:date="2025-04-15T15:33:13Z" w:initials="MO">
+    <w:p>
+      <w:pPr>
+        <w:overflowPunct w:val="true"/>
         <w:rPr/>
       </w:pPr>
       <w:r>
@@ -5469,10 +5798,10 @@
       </w:r>
     </w:p>
   </w:comment>
-  <w:comment w:id="20" w:author="Maycon Oliveira" w:date="2025-04-15T15:34:43Z" w:initials="MO">
-    <w:p>
-      <w:pPr>
-        <w:overflowPunct w:val="false"/>
+  <w:comment w:id="25" w:author="Maycon Oliveira" w:date="2025-04-15T15:34:43Z" w:initials="MO">
+    <w:p>
+      <w:pPr>
+        <w:overflowPunct w:val="true"/>
         <w:rPr/>
       </w:pPr>
       <w:r>
@@ -5484,10 +5813,10 @@
       </w:r>
     </w:p>
   </w:comment>
-  <w:comment w:id="21" w:author="Maycon Oliveira" w:date="2025-04-15T15:37:57Z" w:initials="MO">
-    <w:p>
-      <w:pPr>
-        <w:overflowPunct w:val="false"/>
+  <w:comment w:id="26" w:author="Maycon Oliveira" w:date="2025-04-15T15:37:57Z" w:initials="MO">
+    <w:p>
+      <w:pPr>
+        <w:overflowPunct w:val="true"/>
         <w:rPr/>
       </w:pPr>
       <w:r>
@@ -5499,10 +5828,10 @@
       </w:r>
     </w:p>
   </w:comment>
-  <w:comment w:id="22" w:author="Maycon Oliveira" w:date="2025-04-15T15:38:32Z" w:initials="MO">
-    <w:p>
-      <w:pPr>
-        <w:overflowPunct w:val="false"/>
+  <w:comment w:id="27" w:author="Maycon Oliveira" w:date="2025-04-15T15:38:32Z" w:initials="MO">
+    <w:p>
+      <w:pPr>
+        <w:overflowPunct w:val="true"/>
         <w:rPr/>
       </w:pPr>
       <w:r>
@@ -5514,121 +5843,121 @@
       </w:r>
     </w:p>
   </w:comment>
-  <w:comment w:id="23" w:author="Maycon Oliveira" w:date="2025-05-01T13:47:35Z" w:initials="MO">
-    <w:p>
-      <w:pPr>
-        <w:overflowPunct w:val="false"/>
-        <w:rPr/>
-      </w:pPr>
-      <w:r>
-        <w:rPr>
-          <w:rFonts w:cs="Tahoma" w:eastAsia="Segoe UI"/>
-          <w:lang w:bidi="en-US" w:eastAsia="en-US" w:val="en-US"/>
+  <w:comment w:id="28" w:author="Maycon Oliveira" w:date="2025-05-01T13:47:35Z" w:initials="MO">
+    <w:p>
+      <w:pPr>
+        <w:overflowPunct w:val="true"/>
+        <w:rPr/>
+      </w:pPr>
+      <w:r>
+        <w:rPr>
+          <w:rFonts w:eastAsia="Segoe UI" w:cs="Tahoma"/>
+          <w:lang w:val="en-US" w:eastAsia="en-US" w:bidi="en-US"/>
         </w:rPr>
         <w:t>O artigo de geotagging</w:t>
       </w:r>
     </w:p>
   </w:comment>
-  <w:comment w:id="24" w:author="Maycon Oliveira" w:date="2025-05-01T13:52:56Z" w:initials="MO">
-    <w:p>
-      <w:pPr>
-        <w:overflowPunct w:val="false"/>
-        <w:rPr/>
-      </w:pPr>
-      <w:r>
-        <w:rPr>
-          <w:rFonts w:cs="Tahoma" w:eastAsia="Segoe UI"/>
-          <w:lang w:bidi="en-US" w:eastAsia="en-US" w:val="en-US"/>
+  <w:comment w:id="29" w:author="Maycon Oliveira" w:date="2025-05-01T13:52:56Z" w:initials="MO">
+    <w:p>
+      <w:pPr>
+        <w:overflowPunct w:val="true"/>
+        <w:rPr/>
+      </w:pPr>
+      <w:r>
+        <w:rPr>
+          <w:rFonts w:eastAsia="Segoe UI" w:cs="Tahoma"/>
+          <w:lang w:val="en-US" w:eastAsia="en-US" w:bidi="en-US"/>
         </w:rPr>
         <w:t>admix</w:t>
       </w:r>
     </w:p>
   </w:comment>
-  <w:comment w:id="25" w:author="Maycon Oliveira" w:date="2025-05-01T13:56:32Z" w:initials="MO">
-    <w:p>
-      <w:pPr>
-        <w:overflowPunct w:val="false"/>
-        <w:rPr/>
-      </w:pPr>
-      <w:r>
-        <w:rPr>
-          <w:rFonts w:cs="Tahoma" w:eastAsia="Segoe UI"/>
-          <w:lang w:bidi="en-US" w:eastAsia="en-US" w:val="en-US"/>
+  <w:comment w:id="30" w:author="Maycon Oliveira" w:date="2025-05-01T13:56:32Z" w:initials="MO">
+    <w:p>
+      <w:pPr>
+        <w:overflowPunct w:val="true"/>
+        <w:rPr/>
+      </w:pPr>
+      <w:r>
+        <w:rPr>
+          <w:rFonts w:eastAsia="Segoe UI" w:cs="Tahoma"/>
+          <w:lang w:val="en-US" w:eastAsia="en-US" w:bidi="en-US"/>
         </w:rPr>
         <w:t>sturgeons</w:t>
       </w:r>
     </w:p>
   </w:comment>
-  <w:comment w:id="26" w:author="Maycon Oliveira" w:date="2025-05-01T13:56:26Z" w:initials="MO">
-    <w:p>
-      <w:pPr>
-        <w:overflowPunct w:val="false"/>
-        <w:rPr/>
-      </w:pPr>
-      <w:r>
-        <w:rPr>
-          <w:rFonts w:cs="Tahoma" w:eastAsia="Segoe UI"/>
-          <w:lang w:bidi="en-US" w:eastAsia="en-US" w:val="en-US"/>
+  <w:comment w:id="31" w:author="Maycon Oliveira" w:date="2025-05-01T13:56:26Z" w:initials="MO">
+    <w:p>
+      <w:pPr>
+        <w:overflowPunct w:val="true"/>
+        <w:rPr/>
+      </w:pPr>
+      <w:r>
+        <w:rPr>
+          <w:rFonts w:eastAsia="Segoe UI" w:cs="Tahoma"/>
+          <w:lang w:val="en-US" w:eastAsia="en-US" w:bidi="en-US"/>
         </w:rPr>
         <w:t>gars</w:t>
       </w:r>
     </w:p>
   </w:comment>
-  <w:comment w:id="27" w:author="Maycon Oliveira" w:date="2025-05-01T15:02:21Z" w:initials="MO">
-    <w:p>
-      <w:pPr>
-        <w:overflowPunct w:val="false"/>
-        <w:rPr/>
-      </w:pPr>
-      <w:r>
-        <w:rPr>
-          <w:rFonts w:cs="Tahoma" w:eastAsia="Segoe UI"/>
-          <w:lang w:bidi="en-US" w:eastAsia="en-US" w:val="en-US"/>
+  <w:comment w:id="32" w:author="Maycon Oliveira" w:date="2025-05-01T15:02:21Z" w:initials="MO">
+    <w:p>
+      <w:pPr>
+        <w:overflowPunct w:val="true"/>
+        <w:rPr/>
+      </w:pPr>
+      <w:r>
+        <w:rPr>
+          <w:rFonts w:eastAsia="Segoe UI" w:cs="Tahoma"/>
+          <w:lang w:val="en-US" w:eastAsia="en-US" w:bidi="en-US"/>
         </w:rPr>
         <w:t>PSMC</w:t>
       </w:r>
     </w:p>
   </w:comment>
-  <w:comment w:id="28" w:author="Maycon Oliveira" w:date="2025-05-01T15:02:16Z" w:initials="MO">
-    <w:p>
-      <w:pPr>
-        <w:overflowPunct w:val="false"/>
-        <w:rPr/>
-      </w:pPr>
-      <w:r>
-        <w:rPr>
-          <w:rFonts w:cs="Tahoma" w:eastAsia="Segoe UI"/>
-          <w:lang w:bidi="en-US" w:eastAsia="en-US" w:val="en-US"/>
+  <w:comment w:id="33" w:author="Maycon Oliveira" w:date="2025-05-01T15:02:16Z" w:initials="MO">
+    <w:p>
+      <w:pPr>
+        <w:overflowPunct w:val="true"/>
+        <w:rPr/>
+      </w:pPr>
+      <w:r>
+        <w:rPr>
+          <w:rFonts w:eastAsia="Segoe UI" w:cs="Tahoma"/>
+          <w:lang w:val="en-US" w:eastAsia="en-US" w:bidi="en-US"/>
         </w:rPr>
         <w:t>Dadi</w:t>
       </w:r>
     </w:p>
   </w:comment>
-  <w:comment w:id="29" w:author="Maycon Oliveira" w:date="2025-05-01T15:16:55Z" w:initials="MO">
-    <w:p>
-      <w:pPr>
-        <w:overflowPunct w:val="false"/>
-        <w:rPr/>
-      </w:pPr>
-      <w:r>
-        <w:rPr>
-          <w:rFonts w:cs="Tahoma" w:eastAsia="Segoe UI"/>
-          <w:lang w:bidi="en-US" w:eastAsia="en-US" w:val="en-US"/>
+  <w:comment w:id="34" w:author="Maycon Oliveira" w:date="2025-05-01T15:16:55Z" w:initials="MO">
+    <w:p>
+      <w:pPr>
+        <w:overflowPunct w:val="true"/>
+        <w:rPr/>
+      </w:pPr>
+      <w:r>
+        <w:rPr>
+          <w:rFonts w:eastAsia="Segoe UI" w:cs="Tahoma"/>
+          <w:lang w:val="en-US" w:eastAsia="en-US" w:bidi="en-US"/>
         </w:rPr>
         <w:t>wavelet</w:t>
       </w:r>
     </w:p>
   </w:comment>
-  <w:comment w:id="30" w:author="Maycon Oliveira" w:date="2025-05-01T15:18:38Z" w:initials="MO">
-    <w:p>
-      <w:pPr>
-        <w:overflowPunct w:val="false"/>
-        <w:rPr/>
-      </w:pPr>
-      <w:r>
-        <w:rPr>
-          <w:rFonts w:cs="Tahoma" w:eastAsia="Segoe UI"/>
-          <w:lang w:bidi="en-US" w:eastAsia="en-US" w:val="en-US"/>
+  <w:comment w:id="35" w:author="Maycon Oliveira" w:date="2025-05-01T15:18:38Z" w:initials="MO">
+    <w:p>
+      <w:pPr>
+        <w:overflowPunct w:val="true"/>
+        <w:rPr/>
+      </w:pPr>
+      <w:r>
+        <w:rPr>
+          <w:rFonts w:eastAsia="Segoe UI" w:cs="Tahoma"/>
+          <w:lang w:val="en-US" w:eastAsia="en-US" w:bidi="en-US"/>
         </w:rPr>
         <w:t>pre-print</w:t>
       </w:r>
@@ -5760,7 +6089,7 @@
     </w:r>
     <w:r>
       <w:rPr/>
-      <w:t>15</w:t>
+      <w:t>17</w:t>
     </w:r>
     <w:r>
       <w:rPr/>
@@ -6453,8 +6782,8 @@
       <w:szCs w:val="36"/>
     </w:rPr>
   </w:style>
-  <w:style w:type="paragraph" w:styleId="BlockQuotationuser">
-    <w:name w:val="Block Quotation (user)"/>
+  <w:style w:type="paragraph" w:styleId="BlockQuotation">
+    <w:name w:val="Block Quotation"/>
     <w:basedOn w:val="Normal"/>
     <w:qFormat/>
     <w:pPr>

</xml_diff>